<commit_message>
docs: update System Architecture Document with 10 embedded visual diagrams
</commit_message>
<xml_diff>
--- a/System_Architecture_Document.docx
+++ b/System_Architecture_Document.docx
@@ -141,12 +141,15 @@
       </w:r>
     </w:p>
     <w:p>
+      <w:pPr>
+        <w:ind w:left="0"/>
+      </w:pPr>
       <w:r>
         <w:rPr>
           <w:rFonts w:ascii="Calibri" w:hAnsi="Calibri"/>
           <w:sz w:val="22"/>
         </w:rPr>
-        <w:t>This document presents the complete system architecture for an AI-driven precision agriculture platform integrating two independent AI modules: (1) EfficientNet-B0 CNN-based paddy leaf disease detection (4 classes, 3355 images, 15 training epochs), and (2) Random Forest regression-based crop yield prediction (R²=0.9438, RMSE=174.97 kg/ha, 20 Indian states, 1968–2017). Both modules are unified in a Flask web application. This document follows IEEE 1016-2009 and covers system structure, component interactions, ML pipelines, API contracts, ER design, deployment topology, and future improvements.</w:t>
+        <w:t>This document presents the complete system architecture for an AI-driven precision agriculture platform integrating two independent AI modules: (1) EfficientNet-B0 CNN-based paddy leaf disease detection (4 classes, 3355 images, 15 epochs), and (2) Random Forest regression-based crop yield prediction (R²=0.9438, RMSE=174.97 kg/ha, 20 Indian states, 1968–2017). Both modules are unified in a Flask web application. All architecture diagrams are embedded as generated visual figures. Document follows IEEE 1016-2009.</w:t>
       </w:r>
     </w:p>
     <w:p>
@@ -181,12 +184,15 @@
       </w:r>
     </w:p>
     <w:p>
+      <w:pPr>
+        <w:ind w:left="0"/>
+      </w:pPr>
       <w:r>
         <w:rPr>
           <w:rFonts w:ascii="Calibri" w:hAnsi="Calibri"/>
           <w:sz w:val="22"/>
         </w:rPr>
-        <w:t>This document provides the authoritative architectural description of the AI-Based Paddy Leaf Disease Detection and Crop Yield Prediction system — a final-year major project demonstrating applied deep learning and machine learning in precision agriculture.</w:t>
+        <w:t>This document provides the authoritative architectural description for a final-year major project demonstrating applied deep learning and machine learning in precision agriculture.</w:t>
       </w:r>
     </w:p>
     <w:p>
@@ -276,7 +282,7 @@
                 <w:rFonts w:ascii="Calibri" w:hAnsi="Calibri"/>
                 <w:sz w:val="20"/>
               </w:rPr>
-              <w:t>Low-barrier web interface requiring no technical expertise</w:t>
+              <w:t>Minimal-barrier web interface — no technical expertise required from farmers</w:t>
             </w:r>
           </w:p>
         </w:tc>
@@ -294,7 +300,7 @@
                 <w:rFonts w:ascii="Calibri" w:hAnsi="Calibri"/>
                 <w:sz w:val="20"/>
               </w:rPr>
-              <w:t>Disease Detection Accuracy</w:t>
+              <w:t>Disease Detection</w:t>
             </w:r>
           </w:p>
         </w:tc>
@@ -310,7 +316,7 @@
                 <w:rFonts w:ascii="Calibri" w:hAnsi="Calibri"/>
                 <w:sz w:val="20"/>
               </w:rPr>
-              <w:t>EfficientNet-B0 CNN with ImageNet transfer learning</w:t>
+              <w:t>EfficientNet-B0 CNN with ImageNet transfer learning, 4 disease classes</w:t>
             </w:r>
           </w:p>
         </w:tc>
@@ -327,7 +333,7 @@
                 <w:rFonts w:ascii="Calibri" w:hAnsi="Calibri"/>
                 <w:sz w:val="20"/>
               </w:rPr>
-              <w:t>Yield Prediction Accuracy</w:t>
+              <w:t>Yield Prediction</w:t>
             </w:r>
           </w:p>
         </w:tc>
@@ -342,7 +348,7 @@
                 <w:rFonts w:ascii="Calibri" w:hAnsi="Calibri"/>
                 <w:sz w:val="20"/>
               </w:rPr>
-              <w:t>R² = 0.9438 | RMSE = 174.97 kg/ha | MAPE = 5.35%</w:t>
+              <w:t>R²=0.9438 | RMSE=174.97 kg/ha | MAPE=5.35%</w:t>
             </w:r>
           </w:p>
         </w:tc>
@@ -376,7 +382,7 @@
                 <w:rFonts w:ascii="Calibri" w:hAnsi="Calibri"/>
                 <w:sz w:val="20"/>
               </w:rPr>
-              <w:t>Both modules deployed as a single Flask web application</w:t>
+              <w:t>Both modules in one Flask web application</w:t>
             </w:r>
           </w:p>
         </w:tc>
@@ -535,7 +541,7 @@
                 <w:rFonts w:ascii="Calibri" w:hAnsi="Calibri"/>
                 <w:sz w:val="20"/>
               </w:rPr>
-              <w:t>Efficient CNN architecture by Tan &amp; Le (2019), scaled for accuracy/efficiency</w:t>
+              <w:t>Efficient CNN by Tan &amp; Le (2019) — compound scaled for accuracy and efficiency</w:t>
             </w:r>
           </w:p>
         </w:tc>
@@ -567,7 +573,7 @@
                 <w:rFonts w:ascii="Calibri" w:hAnsi="Calibri"/>
                 <w:sz w:val="20"/>
               </w:rPr>
-              <w:t>Random Forest Regressor</w:t>
+              <w:t>Random Forest Regressor (ensemble of decision trees)</w:t>
             </w:r>
           </w:p>
         </w:tc>
@@ -601,7 +607,7 @@
                 <w:rFonts w:ascii="Calibri" w:hAnsi="Calibri"/>
                 <w:sz w:val="20"/>
               </w:rPr>
-              <w:t>Reusing ImageNet pre-trained weights for domain-specific fine-tuning</w:t>
+              <w:t>Reusing ImageNet pre-trained weights for paddy disease classification</w:t>
             </w:r>
           </w:p>
         </w:tc>
@@ -633,7 +639,7 @@
                 <w:rFonts w:ascii="Calibri" w:hAnsi="Calibri"/>
                 <w:sz w:val="20"/>
               </w:rPr>
-              <w:t>Time-shifted agricultural variable (e.g., Yield_t1 = prior-year yield)</w:t>
+              <w:t>Time-shifted variable, e.g. Yield_t1 = prior-year yield for the same state</w:t>
             </w:r>
           </w:p>
         </w:tc>
@@ -667,7 +673,7 @@
                 <w:rFonts w:ascii="Calibri" w:hAnsi="Calibri"/>
                 <w:sz w:val="20"/>
               </w:rPr>
-              <w:t>Python micro web framework for API routing and template rendering</w:t>
+              <w:t>Python micro web-framework for HTTP routing and template rendering</w:t>
             </w:r>
           </w:p>
         </w:tc>
@@ -699,7 +705,7 @@
                 <w:rFonts w:ascii="Calibri" w:hAnsi="Calibri"/>
                 <w:sz w:val="20"/>
               </w:rPr>
-              <w:t>Python serialisation library for trained ML model persistence</w:t>
+              <w:t>Python library for serialising trained ML models (.pkl files)</w:t>
             </w:r>
           </w:p>
         </w:tc>
@@ -765,12 +771,15 @@
       </w:r>
     </w:p>
     <w:p>
+      <w:pPr>
+        <w:ind w:left="0"/>
+      </w:pPr>
       <w:r>
         <w:rPr>
           <w:rFonts w:ascii="Calibri" w:hAnsi="Calibri"/>
           <w:sz w:val="22"/>
         </w:rPr>
-        <w:t>The system adopts a Monolithic Web Application Architecture with an embedded ML inference layer. All components — frontend rendering, API routing, disease CNN inference, yield RF inference, and file handling — are packaged within a single Flask application process.</w:t>
+        <w:t>Monolithic Web Application Architecture with an embedded ML inference layer. All components — routing, disease CNN, yield RF, image handling — run in a single Flask process.</w:t>
       </w:r>
     </w:p>
     <w:p>
@@ -845,7 +854,7 @@
                 <w:rFonts w:ascii="Calibri" w:hAnsi="Calibri"/>
                 <w:sz w:val="20"/>
               </w:rPr>
-              <w:t>Presentation Layer</w:t>
+              <w:t>Presentation</w:t>
             </w:r>
           </w:p>
         </w:tc>
@@ -860,7 +869,7 @@
                 <w:rFonts w:ascii="Calibri" w:hAnsi="Calibri"/>
                 <w:sz w:val="20"/>
               </w:rPr>
-              <w:t>HTML/CSS/Bootstrap templates rendered via Jinja2</w:t>
+              <w:t>HTML/CSS/Bootstrap templates via Jinja2</w:t>
             </w:r>
           </w:p>
         </w:tc>
@@ -878,7 +887,7 @@
                 <w:rFonts w:ascii="Calibri" w:hAnsi="Calibri"/>
                 <w:sz w:val="20"/>
               </w:rPr>
-              <w:t>Routing Layer</w:t>
+              <w:t>Routing</w:t>
             </w:r>
           </w:p>
         </w:tc>
@@ -894,7 +903,7 @@
                 <w:rFonts w:ascii="Calibri" w:hAnsi="Calibri"/>
                 <w:sz w:val="20"/>
               </w:rPr>
-              <w:t>Flask @app.route handlers map HTTP requests to controller functions</w:t>
+              <w:t>Flask @app.route handlers direct requests to controllers</w:t>
             </w:r>
           </w:p>
         </w:tc>
@@ -911,7 +920,7 @@
                 <w:rFonts w:ascii="Calibri" w:hAnsi="Calibri"/>
                 <w:sz w:val="20"/>
               </w:rPr>
-              <w:t>Inference Layer</w:t>
+              <w:t>Inference</w:t>
             </w:r>
           </w:p>
         </w:tc>
@@ -926,7 +935,7 @@
                 <w:rFonts w:ascii="Calibri" w:hAnsi="Calibri"/>
                 <w:sz w:val="20"/>
               </w:rPr>
-              <w:t>TensorFlow/Keras (disease CNN) + Scikit-learn RF (yield) in-process inference</w:t>
+              <w:t>TensorFlow/Keras (disease) + Scikit-learn RF (yield) in-process</w:t>
             </w:r>
           </w:p>
         </w:tc>
@@ -944,7 +953,7 @@
                 <w:rFonts w:ascii="Calibri" w:hAnsi="Calibri"/>
                 <w:sz w:val="20"/>
               </w:rPr>
-              <w:t>File Handling Layer</w:t>
+              <w:t>File I/O</w:t>
             </w:r>
           </w:p>
         </w:tc>
@@ -960,7 +969,7 @@
                 <w:rFonts w:ascii="Calibri" w:hAnsi="Calibri"/>
                 <w:sz w:val="20"/>
               </w:rPr>
-              <w:t>Pillow processes uploaded images; secure_filename sanitises paths</w:t>
+              <w:t>Pillow processes images; secure_filename prevents path traversal</w:t>
             </w:r>
           </w:p>
         </w:tc>
@@ -977,7 +986,7 @@
                 <w:rFonts w:ascii="Calibri" w:hAnsi="Calibri"/>
                 <w:sz w:val="20"/>
               </w:rPr>
-              <w:t>Utility Layer</w:t>
+              <w:t>Utility</w:t>
             </w:r>
           </w:p>
         </w:tc>
@@ -992,119 +1001,78 @@
                 <w:rFonts w:ascii="Calibri" w:hAnsi="Calibri"/>
                 <w:sz w:val="20"/>
               </w:rPr>
-              <w:t>Default value injection, lag feature computation, unit conversion (kg→t/ha)</w:t>
+              <w:t>Default injection, lag computation, unit conversion (kg/ha → t/ha)</w:t>
             </w:r>
           </w:p>
         </w:tc>
       </w:tr>
     </w:tbl>
     <w:p/>
-    <w:tbl>
-      <w:tblPr>
-        <w:tblStyle w:val="TableGrid"/>
-        <w:tblW w:type="auto" w:w="0"/>
-        <w:tblLook w:firstColumn="1" w:firstRow="1" w:lastColumn="0" w:lastRow="0" w:noHBand="0" w:noVBand="1" w:val="04A0"/>
-      </w:tblPr>
-      <w:tblGrid>
-        <w:gridCol w:w="9066"/>
-      </w:tblGrid>
-      <w:tr>
-        <w:tc>
-          <w:tcPr>
-            <w:tcW w:type="dxa" w:w="9066"/>
-            <w:shd w:fill="1F497D" w:color="auto" w:val="clear"/>
-          </w:tcPr>
-          <w:p>
-            <w:r/>
-            <w:r>
-              <w:rPr>
-                <w:rFonts w:ascii="Calibri" w:hAnsi="Calibri"/>
-                <w:b/>
-                <w:color w:val="FFFFFF"/>
-                <w:sz w:val="20"/>
-              </w:rPr>
-              <w:t>📊  Diagram 1 — System Architecture Diagram  (Mermaid Diagram — renders in VS Code/GitHub/Notion)</w:t>
-            </w:r>
-          </w:p>
-        </w:tc>
-      </w:tr>
-    </w:tbl>
     <w:p>
+      <w:pPr>
+        <w:jc w:val="center"/>
+      </w:pPr>
+      <w:r>
+        <w:drawing>
+          <wp:inline xmlns:a="http://schemas.openxmlformats.org/drawingml/2006/main" xmlns:pic="http://schemas.openxmlformats.org/drawingml/2006/picture">
+            <wp:extent cx="5303520" cy="3812005"/>
+            <wp:docPr id="1" name="Picture 1"/>
+            <wp:cNvGraphicFramePr>
+              <a:graphicFrameLocks noChangeAspect="1"/>
+            </wp:cNvGraphicFramePr>
+            <a:graphic>
+              <a:graphicData uri="http://schemas.openxmlformats.org/drawingml/2006/picture">
+                <pic:pic>
+                  <pic:nvPicPr>
+                    <pic:cNvPr id="0" name="01_system_architecture.png"/>
+                    <pic:cNvPicPr/>
+                  </pic:nvPicPr>
+                  <pic:blipFill>
+                    <a:blip r:embed="rId9"/>
+                    <a:stretch>
+                      <a:fillRect/>
+                    </a:stretch>
+                  </pic:blipFill>
+                  <pic:spPr>
+                    <a:xfrm>
+                      <a:off x="0" y="0"/>
+                      <a:ext cx="5303520" cy="3812005"/>
+                    </a:xfrm>
+                    <a:prstGeom prst="rect"/>
+                  </pic:spPr>
+                </pic:pic>
+              </a:graphicData>
+            </a:graphic>
+          </wp:inline>
+        </w:drawing>
+      </w:r>
+    </w:p>
+    <w:p>
+      <w:pPr>
+        <w:jc w:val="center"/>
+      </w:pPr>
       <w:r>
         <w:rPr>
           <w:rFonts w:ascii="Calibri" w:hAnsi="Calibri"/>
           <w:i/>
-          <w:sz w:val="20"/>
+          <w:color w:val="505050"/>
+          <w:sz w:val="18"/>
         </w:rPr>
-        <w:t>Shows the full top-level system view: actors → Flask pages → AI modules → storage.</w:t>
+        <w:t>Figure 1 — System Architecture Diagram</w:t>
       </w:r>
     </w:p>
     <w:p>
       <w:pPr>
-        <w:ind w:left="340"/>
-        <w:shd w:fill="F0F4FF" w:val="clear"/>
+        <w:ind w:left="170"/>
       </w:pPr>
       <w:r>
         <w:rPr>
-          <w:rFonts w:ascii="Courier New" w:hAnsi="Courier New"/>
-          <w:color w:val="1E1E1E"/>
-          <w:sz w:val="17"/>
+          <w:rFonts w:ascii="Calibri" w:hAnsi="Calibri"/>
+          <w:i/>
+          <w:color w:val="3C3C3C"/>
+          <w:sz w:val="20"/>
         </w:rPr>
-        <w:t>graph TB</w:t>
-        <w:br/>
-        <w:t xml:space="preserve">    subgraph ACTORS["External Actors"]</w:t>
-        <w:br/>
-        <w:t xml:space="preserve">        U1["Farmer"] U2["Agricultural Analyst"]</w:t>
-        <w:br/>
-        <w:t xml:space="preserve">    end</w:t>
-        <w:br/>
-        <w:t xml:space="preserve">    subgraph WEBAPP["Flask Web Application (Monolithic)"]</w:t>
-        <w:br/>
-        <w:t xml:space="preserve">        HP["Home Page /index"]</w:t>
-        <w:br/>
-        <w:t xml:space="preserve">        DP["Disease Detection Page /disease"]</w:t>
-        <w:br/>
-        <w:t xml:space="preserve">        YP["Yield Prediction Page /yield"]</w:t>
-        <w:br/>
-        <w:t xml:space="preserve">        subgraph INFERENCE["ML Inference Layer"]</w:t>
-        <w:br/>
-        <w:t xml:space="preserve">            CNN["EfficientNet-B0\n(disease_model.h5)"]</w:t>
-        <w:br/>
-        <w:t xml:space="preserve">            RF["Random Forest\n(yield_model.pkl)"]</w:t>
-        <w:br/>
-        <w:t xml:space="preserve">        end</w:t>
-        <w:br/>
-        <w:t xml:space="preserve">        subgraph UTILS["Utility Layer"]</w:t>
-        <w:br/>
-        <w:t xml:space="preserve">            PREP["Image Preprocessor (Pillow)"]</w:t>
-        <w:br/>
-        <w:t xml:space="preserve">            FEAT["Feature Engineer (Defaults)"]</w:t>
-        <w:br/>
-        <w:t xml:space="preserve">            CONV["Unit Converter kg/ha→t/ha"]</w:t>
-        <w:br/>
-        <w:t xml:space="preserve">        end</w:t>
-        <w:br/>
-        <w:t xml:space="preserve">    end</w:t>
-        <w:br/>
-        <w:t xml:space="preserve">    subgraph STORAGE["Storage"]</w:t>
-        <w:br/>
-        <w:t xml:space="preserve">        IMGSTORE["uploads/ folder"]</w:t>
-        <w:br/>
-        <w:t xml:space="preserve">        MODELS["models/ (.h5 / .pkl)"]</w:t>
-        <w:br/>
-        <w:t xml:space="preserve">    end</w:t>
-        <w:br/>
-        <w:t xml:space="preserve">    U1 --&gt;|"Upload leaf image"| DP</w:t>
-        <w:br/>
-        <w:t xml:space="preserve">    U2 --&gt;|"Enter soil params"| YP</w:t>
-        <w:br/>
-        <w:t xml:space="preserve">    DP --&gt; PREP --&gt; CNN --&gt; DP</w:t>
-        <w:br/>
-        <w:t xml:space="preserve">    YP --&gt; FEAT --&gt; RF --&gt; CONV --&gt; YP</w:t>
-        <w:br/>
-        <w:t xml:space="preserve">    DP &lt;--&gt; IMGSTORE</w:t>
-        <w:br/>
-        <w:t xml:space="preserve">    CNN &amp; RF &lt;--&gt;|"load at startup"| MODELS</w:t>
+        <w:t>Shows the full system: external actors, Flask pages, ML inference layer, utility layer, and storage.</w:t>
       </w:r>
     </w:p>
     <w:p/>
@@ -1118,15 +1086,6 @@
           <w:color w:val="1F497D"/>
         </w:rPr>
         <w:t>3. High-Level Architecture</w:t>
-      </w:r>
-    </w:p>
-    <w:p>
-      <w:r>
-        <w:rPr>
-          <w:rFonts w:ascii="Calibri" w:hAnsi="Calibri"/>
-          <w:sz w:val="22"/>
-        </w:rPr>
-        <w:t>The high-level architecture shows three logical tiers: the client browser, the Flask application server (with embedded ML inference), and the filesystem storage for uploaded images and model artefacts.</w:t>
       </w:r>
     </w:p>
     <w:tbl>
@@ -1204,7 +1163,7 @@
                 <w:rFonts w:ascii="Calibri" w:hAnsi="Calibri"/>
                 <w:sz w:val="20"/>
               </w:rPr>
-              <w:t>Web browser (Chrome/Firefox). Sends HTTP GET/POST to Flask server.</w:t>
+              <w:t>Web browser — sends HTTP GET/POST to Flask server on localhost:5000</w:t>
             </w:r>
           </w:p>
         </w:tc>
@@ -1238,7 +1197,7 @@
                 <w:rFonts w:ascii="Calibri" w:hAnsi="Calibri"/>
                 <w:sz w:val="20"/>
               </w:rPr>
-              <w:t>Flask server, URL router, Disease Controller, Yield Controller, Image Preprocessor, Feature Engineer, in-memory ML models.</w:t>
+              <w:t>Flask router, Disease Controller, Yield Controller, Image Preprocessor, Feature Engineer, in-memory EfficientNet-B0 and Random Forest models</w:t>
             </w:r>
           </w:p>
         </w:tc>
@@ -1270,7 +1229,7 @@
                 <w:rFonts w:ascii="Calibri" w:hAnsi="Calibri"/>
                 <w:sz w:val="20"/>
               </w:rPr>
-              <w:t>Filesystem: uploads/ (images), models/ (.h5, .pkl, preprocessor.pkl), static/ (CSS/JS).</w:t>
+              <w:t>Filesystem: uploads/ (leaf images), models/ (.h5, .pkl), static/ (CSS/JS)</w:t>
             </w:r>
           </w:p>
         </w:tc>
@@ -1361,7 +1320,7 @@
                 <w:rFonts w:ascii="Calibri" w:hAnsi="Calibri"/>
                 <w:sz w:val="20"/>
               </w:rPr>
-              <w:t>Model Architecture</w:t>
+              <w:t>Model</w:t>
             </w:r>
           </w:p>
         </w:tc>
@@ -1376,7 +1335,7 @@
                 <w:rFonts w:ascii="Calibri" w:hAnsi="Calibri"/>
                 <w:sz w:val="20"/>
               </w:rPr>
-              <w:t>EfficientNet-B0 (Transfer Learning, ImageNet)</w:t>
+              <w:t>EfficientNet-B0 (Transfer Learning, ImageNet weights)</w:t>
             </w:r>
           </w:p>
         </w:tc>
@@ -1427,7 +1386,7 @@
                 <w:rFonts w:ascii="Calibri" w:hAnsi="Calibri"/>
                 <w:sz w:val="20"/>
               </w:rPr>
-              <w:t>Input Resolution</w:t>
+              <w:t>Input</w:t>
             </w:r>
           </w:p>
         </w:tc>
@@ -1442,7 +1401,7 @@
                 <w:rFonts w:ascii="Calibri" w:hAnsi="Calibri"/>
                 <w:sz w:val="20"/>
               </w:rPr>
-              <w:t>224 × 224 × 3 (RGB)</w:t>
+              <w:t>224 × 224 × 3 RGB — preprocessed with efficientnet.preprocess_input</w:t>
             </w:r>
           </w:p>
         </w:tc>
@@ -1460,7 +1419,7 @@
                 <w:rFonts w:ascii="Calibri" w:hAnsi="Calibri"/>
                 <w:sz w:val="20"/>
               </w:rPr>
-              <w:t>Output Classes</w:t>
+              <w:t>Classes</w:t>
             </w:r>
           </w:p>
         </w:tc>
@@ -1476,7 +1435,7 @@
                 <w:rFonts w:ascii="Calibri" w:hAnsi="Calibri"/>
                 <w:sz w:val="20"/>
               </w:rPr>
-              <w:t>4: Healthy (0), Brown Spot (1), Leaf Blast (2), Hispa (3)</w:t>
+              <w:t>0=Healthy | 1=Brown Spot | 2=Leaf Blast | 3=Hispa</w:t>
             </w:r>
           </w:p>
         </w:tc>
@@ -1493,7 +1452,7 @@
                 <w:rFonts w:ascii="Calibri" w:hAnsi="Calibri"/>
                 <w:sz w:val="20"/>
               </w:rPr>
-              <w:t>Dataset: Total</w:t>
+              <w:t>Dataset Total</w:t>
             </w:r>
           </w:p>
         </w:tc>
@@ -1508,7 +1467,7 @@
                 <w:rFonts w:ascii="Calibri" w:hAnsi="Calibri"/>
                 <w:sz w:val="20"/>
               </w:rPr>
-              <w:t>3,355 images</w:t>
+              <w:t>3,355 images (Kaggle)</w:t>
             </w:r>
           </w:p>
         </w:tc>
@@ -1526,7 +1485,7 @@
                 <w:rFonts w:ascii="Calibri" w:hAnsi="Calibri"/>
                 <w:sz w:val="20"/>
               </w:rPr>
-              <w:t>Dataset: Train</w:t>
+              <w:t>Train / Val</w:t>
             </w:r>
           </w:p>
         </w:tc>
@@ -1542,7 +1501,7 @@
                 <w:rFonts w:ascii="Calibri" w:hAnsi="Calibri"/>
                 <w:sz w:val="20"/>
               </w:rPr>
-              <w:t>2,684 images (80%)</w:t>
+              <w:t>2,684 (80%) / 671 (20%)</w:t>
             </w:r>
           </w:p>
         </w:tc>
@@ -1559,7 +1518,7 @@
                 <w:rFonts w:ascii="Calibri" w:hAnsi="Calibri"/>
                 <w:sz w:val="20"/>
               </w:rPr>
-              <w:t>Dataset: Validation</w:t>
+              <w:t>Epochs</w:t>
             </w:r>
           </w:p>
         </w:tc>
@@ -1574,7 +1533,7 @@
                 <w:rFonts w:ascii="Calibri" w:hAnsi="Calibri"/>
                 <w:sz w:val="20"/>
               </w:rPr>
-              <w:t>671 images (20%)</w:t>
+              <w:t>15 | Optimizer: Adam | Loss: Categorical Cross-Entropy</w:t>
             </w:r>
           </w:p>
         </w:tc>
@@ -1592,7 +1551,7 @@
                 <w:rFonts w:ascii="Calibri" w:hAnsi="Calibri"/>
                 <w:sz w:val="20"/>
               </w:rPr>
-              <w:t>Training Epochs</w:t>
+              <w:t>Top Layers</w:t>
             </w:r>
           </w:p>
         </w:tc>
@@ -1608,73 +1567,7 @@
                 <w:rFonts w:ascii="Calibri" w:hAnsi="Calibri"/>
                 <w:sz w:val="20"/>
               </w:rPr>
-              <w:t>15</w:t>
-            </w:r>
-          </w:p>
-        </w:tc>
-      </w:tr>
-      <w:tr>
-        <w:tc>
-          <w:tcPr>
-            <w:tcW w:type="dxa" w:w="3402"/>
-          </w:tcPr>
-          <w:p>
-            <w:r/>
-            <w:r>
-              <w:rPr>
-                <w:rFonts w:ascii="Calibri" w:hAnsi="Calibri"/>
-                <w:sz w:val="20"/>
-              </w:rPr>
-              <w:t>Top Layers</w:t>
-            </w:r>
-          </w:p>
-        </w:tc>
-        <w:tc>
-          <w:tcPr>
-            <w:tcW w:type="dxa" w:w="5953"/>
-          </w:tcPr>
-          <w:p>
-            <w:r/>
-            <w:r>
-              <w:rPr>
-                <w:rFonts w:ascii="Calibri" w:hAnsi="Calibri"/>
-                <w:sz w:val="20"/>
-              </w:rPr>
-              <w:t>GlobalAveragePooling2D → Dense(128, ReLU) → Dense(4, Softmax)</w:t>
-            </w:r>
-          </w:p>
-        </w:tc>
-      </w:tr>
-      <w:tr>
-        <w:tc>
-          <w:tcPr>
-            <w:tcW w:type="dxa" w:w="3402"/>
-            <w:shd w:fill="DCE6F1" w:color="auto" w:val="clear"/>
-          </w:tcPr>
-          <w:p>
-            <w:r/>
-            <w:r>
-              <w:rPr>
-                <w:rFonts w:ascii="Calibri" w:hAnsi="Calibri"/>
-                <w:sz w:val="20"/>
-              </w:rPr>
-              <w:t>Preprocessing</w:t>
-            </w:r>
-          </w:p>
-        </w:tc>
-        <w:tc>
-          <w:tcPr>
-            <w:tcW w:type="dxa" w:w="5953"/>
-            <w:shd w:fill="DCE6F1" w:color="auto" w:val="clear"/>
-          </w:tcPr>
-          <w:p>
-            <w:r/>
-            <w:r>
-              <w:rPr>
-                <w:rFonts w:ascii="Calibri" w:hAnsi="Calibri"/>
-                <w:sz w:val="20"/>
-              </w:rPr>
-              <w:t>tf.keras.applications.efficientnet.preprocess_input</w:t>
+              <w:t>GlobalAvgPool2D → Dense(128,ReLU)+Dropout(0.3) → Dense(4,Softmax)</w:t>
             </w:r>
           </w:p>
         </w:tc>
@@ -1713,80 +1606,71 @@
       </w:tr>
     </w:tbl>
     <w:p/>
-    <w:tbl>
-      <w:tblPr>
-        <w:tblStyle w:val="TableGrid"/>
-        <w:tblW w:type="auto" w:w="0"/>
-        <w:tblLook w:firstColumn="1" w:firstRow="1" w:lastColumn="0" w:lastRow="0" w:noHBand="0" w:noVBand="1" w:val="04A0"/>
-      </w:tblPr>
-      <w:tblGrid>
-        <w:gridCol w:w="9066"/>
-      </w:tblGrid>
-      <w:tr>
-        <w:tc>
-          <w:tcPr>
-            <w:tcW w:type="dxa" w:w="9066"/>
-            <w:shd w:fill="1F497D" w:color="auto" w:val="clear"/>
-          </w:tcPr>
-          <w:p>
-            <w:r/>
-            <w:r>
-              <w:rPr>
-                <w:rFonts w:ascii="Calibri" w:hAnsi="Calibri"/>
-                <w:b/>
-                <w:color w:val="FFFFFF"/>
-                <w:sz w:val="20"/>
-              </w:rPr>
-              <w:t>📊  Diagram 2 — Component Diagram (Disease Detection)  (Mermaid Diagram — renders in VS Code/GitHub/Notion)</w:t>
-            </w:r>
-          </w:p>
-        </w:tc>
-      </w:tr>
-    </w:tbl>
     <w:p>
+      <w:pPr>
+        <w:jc w:val="center"/>
+      </w:pPr>
+      <w:r>
+        <w:drawing>
+          <wp:inline xmlns:a="http://schemas.openxmlformats.org/drawingml/2006/main" xmlns:pic="http://schemas.openxmlformats.org/drawingml/2006/picture">
+            <wp:extent cx="5303520" cy="2573343"/>
+            <wp:docPr id="2" name="Picture 2"/>
+            <wp:cNvGraphicFramePr>
+              <a:graphicFrameLocks noChangeAspect="1"/>
+            </wp:cNvGraphicFramePr>
+            <a:graphic>
+              <a:graphicData uri="http://schemas.openxmlformats.org/drawingml/2006/picture">
+                <pic:pic>
+                  <pic:nvPicPr>
+                    <pic:cNvPr id="0" name="02_component_disease.png"/>
+                    <pic:cNvPicPr/>
+                  </pic:nvPicPr>
+                  <pic:blipFill>
+                    <a:blip r:embed="rId10"/>
+                    <a:stretch>
+                      <a:fillRect/>
+                    </a:stretch>
+                  </pic:blipFill>
+                  <pic:spPr>
+                    <a:xfrm>
+                      <a:off x="0" y="0"/>
+                      <a:ext cx="5303520" cy="2573343"/>
+                    </a:xfrm>
+                    <a:prstGeom prst="rect"/>
+                  </pic:spPr>
+                </pic:pic>
+              </a:graphicData>
+            </a:graphic>
+          </wp:inline>
+        </w:drawing>
+      </w:r>
+    </w:p>
+    <w:p>
+      <w:pPr>
+        <w:jc w:val="center"/>
+      </w:pPr>
       <w:r>
         <w:rPr>
           <w:rFonts w:ascii="Calibri" w:hAnsi="Calibri"/>
           <w:i/>
-          <w:sz w:val="20"/>
+          <w:color w:val="505050"/>
+          <w:sz w:val="18"/>
         </w:rPr>
-        <w:t>Shows internal components from UI upload form → preprocessing pipeline → CNN → result.</w:t>
+        <w:t>Figure 2 — Component Diagram: Disease Detection Pipeline</w:t>
       </w:r>
     </w:p>
     <w:p>
       <w:pPr>
-        <w:ind w:left="340"/>
-        <w:shd w:fill="F0F4FF" w:val="clear"/>
+        <w:ind w:left="170"/>
       </w:pPr>
       <w:r>
         <w:rPr>
-          <w:rFonts w:ascii="Courier New" w:hAnsi="Courier New"/>
-          <w:color w:val="1E1E1E"/>
-          <w:sz w:val="17"/>
+          <w:rFonts w:ascii="Calibri" w:hAnsi="Calibri"/>
+          <w:i/>
+          <w:color w:val="3C3C3C"/>
+          <w:sz w:val="20"/>
         </w:rPr>
-        <w:t>graph LR</w:t>
-        <w:br/>
-        <w:t xml:space="preserve">    FORM["Image Upload Form (HTML)"] --&gt;|multipart| R1["POST /predict-disease"]</w:t>
-        <w:br/>
-        <w:t xml:space="preserve">    R1 --&gt; SAVE["Save to uploads/"]</w:t>
-        <w:br/>
-        <w:t xml:space="preserve">    SAVE --&gt; LOAD["Load Image (Pillow)"]</w:t>
-        <w:br/>
-        <w:t xml:space="preserve">    LOAD --&gt; RESIZE["Resize 224x224"]</w:t>
-        <w:br/>
-        <w:t xml:space="preserve">    RESIZE --&gt; NORM["EfficientNet preprocess_input()"]</w:t>
-        <w:br/>
-        <w:t xml:space="preserve">    NORM --&gt; EXPAND["np.expand_dims (batch)"]</w:t>
-        <w:br/>
-        <w:t xml:space="preserve">    EXPAND --&gt; PREDICT["model.predict(X)"]</w:t>
-        <w:br/>
-        <w:t xml:space="preserve">    PREDICT --&gt; ARGMAX["np.argmax → class index"]</w:t>
-        <w:br/>
-        <w:t xml:space="preserve">    ARGMAX --&gt; MAP["Index → Label"]</w:t>
-        <w:br/>
-        <w:t xml:space="preserve">    MAP --&gt; RESULT["Result Display"]</w:t>
-        <w:br/>
-        <w:t xml:space="preserve">    H5["disease_model.h5"] --&gt;|loaded at startup| PREDICT</w:t>
+        <w:t>Step-by-step flow from image upload through preprocessing to CNN classification and result display.</w:t>
       </w:r>
     </w:p>
     <w:p/>
@@ -1877,7 +1761,7 @@
                 <w:rFonts w:ascii="Calibri" w:hAnsi="Calibri"/>
                 <w:sz w:val="20"/>
               </w:rPr>
-              <w:t>Random Forest Regressor (Scikit-learn)</w:t>
+              <w:t>Random Forest Regressor (Scikit-learn | Joblib .pkl)</w:t>
             </w:r>
           </w:p>
         </w:tc>
@@ -1895,7 +1779,7 @@
                 <w:rFonts w:ascii="Calibri" w:hAnsi="Calibri"/>
                 <w:sz w:val="20"/>
               </w:rPr>
-              <w:t>Serialisation</w:t>
+              <w:t>Training Data</w:t>
             </w:r>
           </w:p>
         </w:tc>
@@ -1903,38 +1787,6 @@
           <w:tcPr>
             <w:tcW w:type="dxa" w:w="5953"/>
             <w:shd w:fill="DCE6F1" w:color="auto" w:val="clear"/>
-          </w:tcPr>
-          <w:p>
-            <w:r/>
-            <w:r>
-              <w:rPr>
-                <w:rFonts w:ascii="Calibri" w:hAnsi="Calibri"/>
-                <w:sz w:val="20"/>
-              </w:rPr>
-              <w:t>Joblib (.pkl)</w:t>
-            </w:r>
-          </w:p>
-        </w:tc>
-      </w:tr>
-      <w:tr>
-        <w:tc>
-          <w:tcPr>
-            <w:tcW w:type="dxa" w:w="3402"/>
-          </w:tcPr>
-          <w:p>
-            <w:r/>
-            <w:r>
-              <w:rPr>
-                <w:rFonts w:ascii="Calibri" w:hAnsi="Calibri"/>
-                <w:sz w:val="20"/>
-              </w:rPr>
-              <w:t>Training Dataset</w:t>
-            </w:r>
-          </w:p>
-        </w:tc>
-        <w:tc>
-          <w:tcPr>
-            <w:tcW w:type="dxa" w:w="5953"/>
           </w:tcPr>
           <w:p>
             <w:r/>
@@ -1952,6 +1804,38 @@
         <w:tc>
           <w:tcPr>
             <w:tcW w:type="dxa" w:w="3402"/>
+          </w:tcPr>
+          <w:p>
+            <w:r/>
+            <w:r>
+              <w:rPr>
+                <w:rFonts w:ascii="Calibri" w:hAnsi="Calibri"/>
+                <w:sz w:val="20"/>
+              </w:rPr>
+              <w:t>Train/Test Split</w:t>
+            </w:r>
+          </w:p>
+        </w:tc>
+        <w:tc>
+          <w:tcPr>
+            <w:tcW w:type="dxa" w:w="5953"/>
+          </w:tcPr>
+          <w:p>
+            <w:r/>
+            <w:r>
+              <w:rPr>
+                <w:rFonts w:ascii="Calibri" w:hAnsi="Calibri"/>
+                <w:sz w:val="20"/>
+              </w:rPr>
+              <w:t>Chronological: Train 1968–2012 | Test 2013–2017 (no data leakage)</w:t>
+            </w:r>
+          </w:p>
+        </w:tc>
+      </w:tr>
+      <w:tr>
+        <w:tc>
+          <w:tcPr>
+            <w:tcW w:type="dxa" w:w="3402"/>
             <w:shd w:fill="DCE6F1" w:color="auto" w:val="clear"/>
           </w:tcPr>
           <w:p>
@@ -1961,7 +1845,7 @@
                 <w:rFonts w:ascii="Calibri" w:hAnsi="Calibri"/>
                 <w:sz w:val="20"/>
               </w:rPr>
-              <w:t>User-Supplied Features</w:t>
+              <w:t>User Inputs</w:t>
             </w:r>
           </w:p>
         </w:tc>
@@ -1994,7 +1878,7 @@
                 <w:rFonts w:ascii="Calibri" w:hAnsi="Calibri"/>
                 <w:sz w:val="20"/>
               </w:rPr>
-              <w:t>Auto-Filled Features</w:t>
+              <w:t>Auto-filled</w:t>
             </w:r>
           </w:p>
         </w:tc>
@@ -2009,7 +1893,7 @@
                 <w:rFonts w:ascii="Calibri" w:hAnsi="Calibri"/>
                 <w:sz w:val="20"/>
               </w:rPr>
-              <w:t>8: Year=2017, Wind=3.5, Solar=18, Yield_t1/t2, Rainfall_t1/t2, Temp_t1</w:t>
+              <w:t>8: Year=2017, Wind=3.5, Solar=18, lag features derived from user inputs</w:t>
             </w:r>
           </w:p>
         </w:tc>
@@ -2027,7 +1911,7 @@
                 <w:rFonts w:ascii="Calibri" w:hAnsi="Calibri"/>
                 <w:sz w:val="20"/>
               </w:rPr>
-              <w:t>Total Features at Inference</w:t>
+              <w:t>Total Features</w:t>
             </w:r>
           </w:p>
         </w:tc>
@@ -2192,39 +2076,6 @@
                 <w:rFonts w:ascii="Calibri" w:hAnsi="Calibri"/>
                 <w:sz w:val="20"/>
               </w:rPr>
-              <w:t>Output</w:t>
-            </w:r>
-          </w:p>
-        </w:tc>
-        <w:tc>
-          <w:tcPr>
-            <w:tcW w:type="dxa" w:w="5953"/>
-          </w:tcPr>
-          <w:p>
-            <w:r/>
-            <w:r>
-              <w:rPr>
-                <w:rFonts w:ascii="Calibri" w:hAnsi="Calibri"/>
-                <w:sz w:val="20"/>
-              </w:rPr>
-              <w:t>Predicted yield in kg/ha, converted to tonnes/ha</w:t>
-            </w:r>
-          </w:p>
-        </w:tc>
-      </w:tr>
-      <w:tr>
-        <w:tc>
-          <w:tcPr>
-            <w:tcW w:type="dxa" w:w="3402"/>
-            <w:shd w:fill="DCE6F1" w:color="auto" w:val="clear"/>
-          </w:tcPr>
-          <w:p>
-            <w:r/>
-            <w:r>
-              <w:rPr>
-                <w:rFonts w:ascii="Calibri" w:hAnsi="Calibri"/>
-                <w:sz w:val="20"/>
-              </w:rPr>
               <w:t>Artefact</w:t>
             </w:r>
           </w:p>
@@ -2232,7 +2083,6 @@
         <w:tc>
           <w:tcPr>
             <w:tcW w:type="dxa" w:w="5953"/>
-            <w:shd w:fill="DCE6F1" w:color="auto" w:val="clear"/>
           </w:tcPr>
           <w:p>
             <w:r/>
@@ -2888,7 +2738,7 @@
                 <w:rFonts w:ascii="Calibri" w:hAnsi="Calibri"/>
                 <w:sz w:val="20"/>
               </w:rPr>
-              <w:t>Computed lag estimate</w:t>
+              <w:t>Lag estimate (prior year)</w:t>
             </w:r>
           </w:p>
         </w:tc>
@@ -2904,7 +2754,7 @@
                 <w:rFonts w:ascii="Calibri" w:hAnsi="Calibri"/>
                 <w:sz w:val="20"/>
               </w:rPr>
-              <w:t>prior yield proxy</w:t>
+              <w:t>computed from model region avg</w:t>
             </w:r>
           </w:p>
         </w:tc>
@@ -2936,7 +2786,7 @@
                 <w:rFonts w:ascii="Calibri" w:hAnsi="Calibri"/>
                 <w:sz w:val="20"/>
               </w:rPr>
-              <w:t>Computed lag estimate</w:t>
+              <w:t>Lag estimate (2 years prior)</w:t>
             </w:r>
           </w:p>
         </w:tc>
@@ -2951,7 +2801,7 @@
                 <w:rFonts w:ascii="Calibri" w:hAnsi="Calibri"/>
                 <w:sz w:val="20"/>
               </w:rPr>
-              <w:t>prior -2 yield proxy</w:t>
+              <w:t>computed from model region avg</w:t>
             </w:r>
           </w:p>
         </w:tc>
@@ -2985,7 +2835,7 @@
                 <w:rFonts w:ascii="Calibri" w:hAnsi="Calibri"/>
                 <w:sz w:val="20"/>
               </w:rPr>
-              <w:t>Derived: rainfall × 0.95</w:t>
+              <w:t>Rainfall × 0.95</w:t>
             </w:r>
           </w:p>
         </w:tc>
@@ -3033,7 +2883,7 @@
                 <w:rFonts w:ascii="Calibri" w:hAnsi="Calibri"/>
                 <w:sz w:val="20"/>
               </w:rPr>
-              <w:t>Derived: rainfall × 0.90</w:t>
+              <w:t>Rainfall × 0.90</w:t>
             </w:r>
           </w:p>
         </w:tc>
@@ -3082,7 +2932,7 @@
                 <w:rFonts w:ascii="Calibri" w:hAnsi="Calibri"/>
                 <w:sz w:val="20"/>
               </w:rPr>
-              <w:t>Derived: temperature − 0.3</w:t>
+              <w:t>Temperature − 0.3</w:t>
             </w:r>
           </w:p>
         </w:tc>
@@ -3117,141 +2967,139 @@
         <w:t>5. Data Architecture</w:t>
       </w:r>
     </w:p>
-    <w:tbl>
-      <w:tblPr>
-        <w:tblStyle w:val="TableGrid"/>
-        <w:tblW w:type="auto" w:w="0"/>
-        <w:tblLook w:firstColumn="1" w:firstRow="1" w:lastColumn="0" w:lastRow="0" w:noHBand="0" w:noVBand="1" w:val="04A0"/>
-      </w:tblPr>
-      <w:tblGrid>
-        <w:gridCol w:w="9066"/>
-      </w:tblGrid>
-      <w:tr>
-        <w:tc>
-          <w:tcPr>
-            <w:tcW w:type="dxa" w:w="9066"/>
-            <w:shd w:fill="1F497D" w:color="auto" w:val="clear"/>
-          </w:tcPr>
-          <w:p>
-            <w:r/>
-            <w:r>
-              <w:rPr>
-                <w:rFonts w:ascii="Calibri" w:hAnsi="Calibri"/>
-                <w:b/>
-                <w:color w:val="FFFFFF"/>
-                <w:sz w:val="20"/>
-              </w:rPr>
-              <w:t>📊  Diagram 3 — DFD Level 0 (Context Diagram)  (Mermaid Diagram — renders in VS Code/GitHub/Notion)</w:t>
-            </w:r>
-          </w:p>
-        </w:tc>
-      </w:tr>
-    </w:tbl>
     <w:p>
+      <w:pPr>
+        <w:jc w:val="center"/>
+      </w:pPr>
+      <w:r>
+        <w:drawing>
+          <wp:inline xmlns:a="http://schemas.openxmlformats.org/drawingml/2006/main" xmlns:pic="http://schemas.openxmlformats.org/drawingml/2006/picture">
+            <wp:extent cx="5303520" cy="3577206"/>
+            <wp:docPr id="3" name="Picture 3"/>
+            <wp:cNvGraphicFramePr>
+              <a:graphicFrameLocks noChangeAspect="1"/>
+            </wp:cNvGraphicFramePr>
+            <a:graphic>
+              <a:graphicData uri="http://schemas.openxmlformats.org/drawingml/2006/picture">
+                <pic:pic>
+                  <pic:nvPicPr>
+                    <pic:cNvPr id="0" name="03_dfd_level0.png"/>
+                    <pic:cNvPicPr/>
+                  </pic:nvPicPr>
+                  <pic:blipFill>
+                    <a:blip r:embed="rId11"/>
+                    <a:stretch>
+                      <a:fillRect/>
+                    </a:stretch>
+                  </pic:blipFill>
+                  <pic:spPr>
+                    <a:xfrm>
+                      <a:off x="0" y="0"/>
+                      <a:ext cx="5303520" cy="3577206"/>
+                    </a:xfrm>
+                    <a:prstGeom prst="rect"/>
+                  </pic:spPr>
+                </pic:pic>
+              </a:graphicData>
+            </a:graphic>
+          </wp:inline>
+        </w:drawing>
+      </w:r>
+    </w:p>
+    <w:p>
+      <w:pPr>
+        <w:jc w:val="center"/>
+      </w:pPr>
       <w:r>
         <w:rPr>
           <w:rFonts w:ascii="Calibri" w:hAnsi="Calibri"/>
           <w:i/>
-          <w:sz w:val="20"/>
+          <w:color w:val="505050"/>
+          <w:sz w:val="18"/>
         </w:rPr>
-        <w:t>Shows the system as a single process, with external inputs and outputs.</w:t>
+        <w:t>Figure 3 — DFD Level 0 (Context Diagram)</w:t>
       </w:r>
     </w:p>
     <w:p>
       <w:pPr>
-        <w:ind w:left="340"/>
-        <w:shd w:fill="F0F4FF" w:val="clear"/>
+        <w:ind w:left="170"/>
       </w:pPr>
-      <w:r>
-        <w:rPr>
-          <w:rFonts w:ascii="Courier New" w:hAnsi="Courier New"/>
-          <w:color w:val="1E1E1E"/>
-          <w:sz w:val="17"/>
-        </w:rPr>
-        <w:t>flowchart LR</w:t>
-        <w:br/>
-        <w:t xml:space="preserve">    U1["Farmer / Analyst"] --&gt;|"Leaf Image"| SYS["AI Prediction System"]</w:t>
-        <w:br/>
-        <w:t xml:space="preserve">    U1 --&gt;|"Soil &amp; Climate Params"| SYS</w:t>
-        <w:br/>
-        <w:t xml:space="preserve">    SYS --&gt;|"Disease Label + Confidence"| U1</w:t>
-        <w:br/>
-        <w:t xml:space="preserve">    SYS --&gt;|"Yield kg/ha + t/ha"| U1</w:t>
-      </w:r>
-    </w:p>
-    <w:p/>
-    <w:tbl>
-      <w:tblPr>
-        <w:tblStyle w:val="TableGrid"/>
-        <w:tblW w:type="auto" w:w="0"/>
-        <w:tblLook w:firstColumn="1" w:firstRow="1" w:lastColumn="0" w:lastRow="0" w:noHBand="0" w:noVBand="1" w:val="04A0"/>
-      </w:tblPr>
-      <w:tblGrid>
-        <w:gridCol w:w="9066"/>
-      </w:tblGrid>
-      <w:tr>
-        <w:tc>
-          <w:tcPr>
-            <w:tcW w:type="dxa" w:w="9066"/>
-            <w:shd w:fill="1F497D" w:color="auto" w:val="clear"/>
-          </w:tcPr>
-          <w:p>
-            <w:r/>
-            <w:r>
-              <w:rPr>
-                <w:rFonts w:ascii="Calibri" w:hAnsi="Calibri"/>
-                <w:b/>
-                <w:color w:val="FFFFFF"/>
-                <w:sz w:val="20"/>
-              </w:rPr>
-              <w:t>📊  Diagram 4 — DFD Level 1  (Mermaid Diagram — renders in VS Code/GitHub/Notion)</w:t>
-            </w:r>
-          </w:p>
-        </w:tc>
-      </w:tr>
-    </w:tbl>
-    <w:p>
       <w:r>
         <w:rPr>
           <w:rFonts w:ascii="Calibri" w:hAnsi="Calibri"/>
           <w:i/>
+          <w:color w:val="3C3C3C"/>
           <w:sz w:val="20"/>
         </w:rPr>
-        <w:t>Expands the system into its two prediction processes showing internal data flows.</w:t>
+        <w:t>Shows the system as a single process: Farmer/Analyst inputs → AI Prediction System → outputs.</w:t>
+      </w:r>
+    </w:p>
+    <w:p/>
+    <w:p>
+      <w:pPr>
+        <w:jc w:val="center"/>
+      </w:pPr>
+      <w:r>
+        <w:drawing>
+          <wp:inline xmlns:a="http://schemas.openxmlformats.org/drawingml/2006/main" xmlns:pic="http://schemas.openxmlformats.org/drawingml/2006/picture">
+            <wp:extent cx="5303520" cy="3812005"/>
+            <wp:docPr id="4" name="Picture 4"/>
+            <wp:cNvGraphicFramePr>
+              <a:graphicFrameLocks noChangeAspect="1"/>
+            </wp:cNvGraphicFramePr>
+            <a:graphic>
+              <a:graphicData uri="http://schemas.openxmlformats.org/drawingml/2006/picture">
+                <pic:pic>
+                  <pic:nvPicPr>
+                    <pic:cNvPr id="0" name="04_dfd_level1.png"/>
+                    <pic:cNvPicPr/>
+                  </pic:nvPicPr>
+                  <pic:blipFill>
+                    <a:blip r:embed="rId12"/>
+                    <a:stretch>
+                      <a:fillRect/>
+                    </a:stretch>
+                  </pic:blipFill>
+                  <pic:spPr>
+                    <a:xfrm>
+                      <a:off x="0" y="0"/>
+                      <a:ext cx="5303520" cy="3812005"/>
+                    </a:xfrm>
+                    <a:prstGeom prst="rect"/>
+                  </pic:spPr>
+                </pic:pic>
+              </a:graphicData>
+            </a:graphic>
+          </wp:inline>
+        </w:drawing>
       </w:r>
     </w:p>
     <w:p>
       <w:pPr>
-        <w:ind w:left="340"/>
-        <w:shd w:fill="F0F4FF" w:val="clear"/>
+        <w:jc w:val="center"/>
       </w:pPr>
       <w:r>
         <w:rPr>
-          <w:rFonts w:ascii="Courier New" w:hAnsi="Courier New"/>
-          <w:color w:val="1E1E1E"/>
-          <w:sz w:val="17"/>
+          <w:rFonts w:ascii="Calibri" w:hAnsi="Calibri"/>
+          <w:i/>
+          <w:color w:val="505050"/>
+          <w:sz w:val="18"/>
         </w:rPr>
-        <w:t>flowchart TD</w:t>
-        <w:br/>
-        <w:t xml:space="preserve">    IMG["Leaf Image"] --&gt; P1["1. Image Preprocessing\nResize+Normalise"]</w:t>
-        <w:br/>
-        <w:t xml:space="preserve">    P1 --&gt; P2["2. CNN Inference\nEfficientNet-B0"]</w:t>
-        <w:br/>
-        <w:t xml:space="preserve">    P2 --&gt; OUT1["Disease Label\n+ Confidence %"]</w:t>
-        <w:br/>
-        <w:t xml:space="preserve">    PARAMS["Soil/Climate Params\n(State, N, P, K, T, H, R, pH)"] --&gt; P3["3. Feature Engineering\nDefaults + Lag Computation"]</w:t>
-        <w:br/>
-        <w:t xml:space="preserve">    P3 --&gt; P4["4. RF Inference\nRandom Forest Regressor"]</w:t>
-        <w:br/>
-        <w:t xml:space="preserve">    P4 --&gt; P5["5. Unit Conversion\nkg/ha → t/ha"]</w:t>
-        <w:br/>
-        <w:t xml:space="preserve">    P5 --&gt; OUT2["Predicted Yield\n(kg/ha + t/ha)"]</w:t>
-        <w:br/>
-        <w:t xml:space="preserve">    DS1["uploads/"] &lt;--&gt; P1</w:t>
-        <w:br/>
-        <w:t xml:space="preserve">    DS2["disease_model.h5"] --&gt; P2</w:t>
-        <w:br/>
-        <w:t xml:space="preserve">    DS3["yield_model.pkl\npreprocessor.pkl"] --&gt; P4</w:t>
+        <w:t>Figure 4 — DFD Level 1</w:t>
+      </w:r>
+    </w:p>
+    <w:p>
+      <w:pPr>
+        <w:ind w:left="170"/>
+      </w:pPr>
+      <w:r>
+        <w:rPr>
+          <w:rFonts w:ascii="Calibri" w:hAnsi="Calibri"/>
+          <w:i/>
+          <w:color w:val="3C3C3C"/>
+          <w:sz w:val="20"/>
+        </w:rPr>
+        <w:t>Expands into 6 internal processes and 3 data stores showing all data flows.</w:t>
       </w:r>
     </w:p>
     <w:p/>
@@ -3360,7 +3208,7 @@
                 <w:rFonts w:ascii="Calibri" w:hAnsi="Calibri"/>
                 <w:sz w:val="20"/>
               </w:rPr>
-              <w:t>Total Images</w:t>
+              <w:t>Total</w:t>
             </w:r>
           </w:p>
         </w:tc>
@@ -3376,7 +3224,7 @@
                 <w:rFonts w:ascii="Calibri" w:hAnsi="Calibri"/>
                 <w:sz w:val="20"/>
               </w:rPr>
-              <w:t>3,355</w:t>
+              <w:t>3,355 images</w:t>
             </w:r>
           </w:p>
         </w:tc>
@@ -3393,7 +3241,7 @@
                 <w:rFonts w:ascii="Calibri" w:hAnsi="Calibri"/>
                 <w:sz w:val="20"/>
               </w:rPr>
-              <w:t>Training</w:t>
+              <w:t>Train</w:t>
             </w:r>
           </w:p>
         </w:tc>
@@ -3492,7 +3340,7 @@
                 <w:rFonts w:ascii="Calibri" w:hAnsi="Calibri"/>
                 <w:sz w:val="20"/>
               </w:rPr>
-              <w:t>Input Format</w:t>
+              <w:t>Input</w:t>
             </w:r>
           </w:p>
         </w:tc>
@@ -3602,7 +3450,7 @@
                 <w:rFonts w:ascii="Calibri" w:hAnsi="Calibri"/>
                 <w:sz w:val="20"/>
               </w:rPr>
-              <w:t>India state-level agricultural historical dataset</w:t>
+              <w:t>India state-level historical agricultural dataset</w:t>
             </w:r>
           </w:p>
         </w:tc>
@@ -3636,7 +3484,7 @@
                 <w:rFonts w:ascii="Calibri" w:hAnsi="Calibri"/>
                 <w:sz w:val="20"/>
               </w:rPr>
-              <w:t>20 Indian states</w:t>
+              <w:t>20 Indian states | 1968–2017</w:t>
             </w:r>
           </w:p>
         </w:tc>
@@ -3653,7 +3501,7 @@
                 <w:rFonts w:ascii="Calibri" w:hAnsi="Calibri"/>
                 <w:sz w:val="20"/>
               </w:rPr>
-              <w:t>Time Range</w:t>
+              <w:t>Raw Records</w:t>
             </w:r>
           </w:p>
         </w:tc>
@@ -3668,7 +3516,7 @@
                 <w:rFonts w:ascii="Calibri" w:hAnsi="Calibri"/>
                 <w:sz w:val="20"/>
               </w:rPr>
-              <w:t>1968 – 2017</w:t>
+              <w:t>~14,978 district-level rows</w:t>
             </w:r>
           </w:p>
         </w:tc>
@@ -3686,7 +3534,7 @@
                 <w:rFonts w:ascii="Calibri" w:hAnsi="Calibri"/>
                 <w:sz w:val="20"/>
               </w:rPr>
-              <w:t>Raw Records</w:t>
+              <w:t>Aggregated</w:t>
             </w:r>
           </w:p>
         </w:tc>
@@ -3702,7 +3550,7 @@
                 <w:rFonts w:ascii="Calibri" w:hAnsi="Calibri"/>
                 <w:sz w:val="20"/>
               </w:rPr>
-              <w:t>~14,978 district-level rows</w:t>
+              <w:t>995 samples (state-year, area-weighted)</w:t>
             </w:r>
           </w:p>
         </w:tc>
@@ -3719,7 +3567,7 @@
                 <w:rFonts w:ascii="Calibri" w:hAnsi="Calibri"/>
                 <w:sz w:val="20"/>
               </w:rPr>
-              <w:t>Aggregated Samples</w:t>
+              <w:t>Features</w:t>
             </w:r>
           </w:p>
         </w:tc>
@@ -3734,7 +3582,7 @@
                 <w:rFonts w:ascii="Calibri" w:hAnsi="Calibri"/>
                 <w:sz w:val="20"/>
               </w:rPr>
-              <w:t>995 (state-year level, area-weighted)</w:t>
+              <w:t>16 (including 6 lag-engineered variables)</w:t>
             </w:r>
           </w:p>
         </w:tc>
@@ -3752,7 +3600,7 @@
                 <w:rFonts w:ascii="Calibri" w:hAnsi="Calibri"/>
                 <w:sz w:val="20"/>
               </w:rPr>
-              <w:t>Features</w:t>
+              <w:t>Target</w:t>
             </w:r>
           </w:p>
         </w:tc>
@@ -3768,105 +3616,7 @@
                 <w:rFonts w:ascii="Calibri" w:hAnsi="Calibri"/>
                 <w:sz w:val="20"/>
               </w:rPr>
-              <w:t>16 (including 6 lag-engineered features)</w:t>
-            </w:r>
-          </w:p>
-        </w:tc>
-      </w:tr>
-      <w:tr>
-        <w:tc>
-          <w:tcPr>
-            <w:tcW w:type="dxa" w:w="3402"/>
-          </w:tcPr>
-          <w:p>
-            <w:r/>
-            <w:r>
-              <w:rPr>
-                <w:rFonts w:ascii="Calibri" w:hAnsi="Calibri"/>
-                <w:sz w:val="20"/>
-              </w:rPr>
-              <w:t>Target Variable</w:t>
-            </w:r>
-          </w:p>
-        </w:tc>
-        <w:tc>
-          <w:tcPr>
-            <w:tcW w:type="dxa" w:w="5953"/>
-          </w:tcPr>
-          <w:p>
-            <w:r/>
-            <w:r>
-              <w:rPr>
-                <w:rFonts w:ascii="Calibri" w:hAnsi="Calibri"/>
-                <w:sz w:val="20"/>
-              </w:rPr>
               <w:t>Yield_kg_per_ha</w:t>
-            </w:r>
-          </w:p>
-        </w:tc>
-      </w:tr>
-      <w:tr>
-        <w:tc>
-          <w:tcPr>
-            <w:tcW w:type="dxa" w:w="3402"/>
-            <w:shd w:fill="DCE6F1" w:color="auto" w:val="clear"/>
-          </w:tcPr>
-          <w:p>
-            <w:r/>
-            <w:r>
-              <w:rPr>
-                <w:rFonts w:ascii="Calibri" w:hAnsi="Calibri"/>
-                <w:sz w:val="20"/>
-              </w:rPr>
-              <w:t>Train Split</w:t>
-            </w:r>
-          </w:p>
-        </w:tc>
-        <w:tc>
-          <w:tcPr>
-            <w:tcW w:type="dxa" w:w="5953"/>
-            <w:shd w:fill="DCE6F1" w:color="auto" w:val="clear"/>
-          </w:tcPr>
-          <w:p>
-            <w:r/>
-            <w:r>
-              <w:rPr>
-                <w:rFonts w:ascii="Calibri" w:hAnsi="Calibri"/>
-                <w:sz w:val="20"/>
-              </w:rPr>
-              <w:t>1968–2012 (time-based, no data leakage)</w:t>
-            </w:r>
-          </w:p>
-        </w:tc>
-      </w:tr>
-      <w:tr>
-        <w:tc>
-          <w:tcPr>
-            <w:tcW w:type="dxa" w:w="3402"/>
-          </w:tcPr>
-          <w:p>
-            <w:r/>
-            <w:r>
-              <w:rPr>
-                <w:rFonts w:ascii="Calibri" w:hAnsi="Calibri"/>
-                <w:sz w:val="20"/>
-              </w:rPr>
-              <w:t>Test Split</w:t>
-            </w:r>
-          </w:p>
-        </w:tc>
-        <w:tc>
-          <w:tcPr>
-            <w:tcW w:type="dxa" w:w="5953"/>
-          </w:tcPr>
-          <w:p>
-            <w:r/>
-            <w:r>
-              <w:rPr>
-                <w:rFonts w:ascii="Calibri" w:hAnsi="Calibri"/>
-                <w:sz w:val="20"/>
-              </w:rPr>
-              <w:t>2013–2017</w:t>
             </w:r>
           </w:p>
         </w:tc>
@@ -3885,153 +3635,139 @@
         <w:t>6. Machine Learning Pipeline Architecture</w:t>
       </w:r>
     </w:p>
-    <w:tbl>
-      <w:tblPr>
-        <w:tblStyle w:val="TableGrid"/>
-        <w:tblW w:type="auto" w:w="0"/>
-        <w:tblLook w:firstColumn="1" w:firstRow="1" w:lastColumn="0" w:lastRow="0" w:noHBand="0" w:noVBand="1" w:val="04A0"/>
-      </w:tblPr>
-      <w:tblGrid>
-        <w:gridCol w:w="9066"/>
-      </w:tblGrid>
-      <w:tr>
-        <w:tc>
-          <w:tcPr>
-            <w:tcW w:type="dxa" w:w="9066"/>
-            <w:shd w:fill="1F497D" w:color="auto" w:val="clear"/>
-          </w:tcPr>
-          <w:p>
-            <w:r/>
-            <w:r>
-              <w:rPr>
-                <w:rFonts w:ascii="Calibri" w:hAnsi="Calibri"/>
-                <w:b/>
-                <w:color w:val="FFFFFF"/>
-                <w:sz w:val="20"/>
-              </w:rPr>
-              <w:t>📊  Diagram 6 — Disease Detection ML Pipeline  (Mermaid Diagram — renders in VS Code/GitHub/Notion)</w:t>
-            </w:r>
-          </w:p>
-        </w:tc>
-      </w:tr>
-    </w:tbl>
     <w:p>
+      <w:pPr>
+        <w:jc w:val="center"/>
+      </w:pPr>
+      <w:r>
+        <w:drawing>
+          <wp:inline xmlns:a="http://schemas.openxmlformats.org/drawingml/2006/main" xmlns:pic="http://schemas.openxmlformats.org/drawingml/2006/picture">
+            <wp:extent cx="5303520" cy="2160456"/>
+            <wp:docPr id="5" name="Picture 5"/>
+            <wp:cNvGraphicFramePr>
+              <a:graphicFrameLocks noChangeAspect="1"/>
+            </wp:cNvGraphicFramePr>
+            <a:graphic>
+              <a:graphicData uri="http://schemas.openxmlformats.org/drawingml/2006/picture">
+                <pic:pic>
+                  <pic:nvPicPr>
+                    <pic:cNvPr id="0" name="06_ml_pipeline_disease.png"/>
+                    <pic:cNvPicPr/>
+                  </pic:nvPicPr>
+                  <pic:blipFill>
+                    <a:blip r:embed="rId13"/>
+                    <a:stretch>
+                      <a:fillRect/>
+                    </a:stretch>
+                  </pic:blipFill>
+                  <pic:spPr>
+                    <a:xfrm>
+                      <a:off x="0" y="0"/>
+                      <a:ext cx="5303520" cy="2160456"/>
+                    </a:xfrm>
+                    <a:prstGeom prst="rect"/>
+                  </pic:spPr>
+                </pic:pic>
+              </a:graphicData>
+            </a:graphic>
+          </wp:inline>
+        </w:drawing>
+      </w:r>
+    </w:p>
+    <w:p>
+      <w:pPr>
+        <w:jc w:val="center"/>
+      </w:pPr>
       <w:r>
         <w:rPr>
           <w:rFonts w:ascii="Calibri" w:hAnsi="Calibri"/>
           <w:i/>
-          <w:sz w:val="20"/>
+          <w:color w:val="505050"/>
+          <w:sz w:val="18"/>
         </w:rPr>
-        <w:t>Full pipeline from raw dataset through training to Flask inference.</w:t>
+        <w:t>Figure 6 — Disease Detection ML Pipeline</w:t>
       </w:r>
     </w:p>
     <w:p>
       <w:pPr>
-        <w:ind w:left="340"/>
-        <w:shd w:fill="F0F4FF" w:val="clear"/>
+        <w:ind w:left="170"/>
       </w:pPr>
-      <w:r>
-        <w:rPr>
-          <w:rFonts w:ascii="Courier New" w:hAnsi="Courier New"/>
-          <w:color w:val="1E1E1E"/>
-          <w:sz w:val="17"/>
-        </w:rPr>
-        <w:t>flowchart LR</w:t>
-        <w:br/>
-        <w:t xml:space="preserve">    A["Raw Dataset\n3355 images / 4 classes"] --&gt; B["Train/Val Split\n80:20"]</w:t>
-        <w:br/>
-        <w:t xml:space="preserve">    B --&gt; C["Data Augmentation\n(rotation, flip, zoom)"]</w:t>
-        <w:br/>
-        <w:t xml:space="preserve">    C --&gt; D["EfficientNet-B0\nBase (frozen ImageNet weights)"]</w:t>
-        <w:br/>
-        <w:t xml:space="preserve">    D --&gt; E["GlobalAvgPool2D"]</w:t>
-        <w:br/>
-        <w:t xml:space="preserve">    E --&gt; F["Dense 128, ReLU + Dropout(0.3)"]</w:t>
-        <w:br/>
-        <w:t xml:space="preserve">    F --&gt; G["Dense 4, Softmax"]</w:t>
-        <w:br/>
-        <w:t xml:space="preserve">    G --&gt; H["Train: 15 Epochs\nAdam | CategoricalCrossEntropy"]</w:t>
-        <w:br/>
-        <w:t xml:space="preserve">    H --&gt; I["Validate Accuracy/Loss"]</w:t>
-        <w:br/>
-        <w:t xml:space="preserve">    I --&gt; J["Save: disease_model.h5"]</w:t>
-        <w:br/>
-        <w:t xml:space="preserve">    J --&gt; K["Flask: preprocess → model.predict()"]</w:t>
-      </w:r>
-    </w:p>
-    <w:p/>
-    <w:tbl>
-      <w:tblPr>
-        <w:tblStyle w:val="TableGrid"/>
-        <w:tblW w:type="auto" w:w="0"/>
-        <w:tblLook w:firstColumn="1" w:firstRow="1" w:lastColumn="0" w:lastRow="0" w:noHBand="0" w:noVBand="1" w:val="04A0"/>
-      </w:tblPr>
-      <w:tblGrid>
-        <w:gridCol w:w="9066"/>
-      </w:tblGrid>
-      <w:tr>
-        <w:tc>
-          <w:tcPr>
-            <w:tcW w:type="dxa" w:w="9066"/>
-            <w:shd w:fill="1F497D" w:color="auto" w:val="clear"/>
-          </w:tcPr>
-          <w:p>
-            <w:r/>
-            <w:r>
-              <w:rPr>
-                <w:rFonts w:ascii="Calibri" w:hAnsi="Calibri"/>
-                <w:b/>
-                <w:color w:val="FFFFFF"/>
-                <w:sz w:val="20"/>
-              </w:rPr>
-              <w:t>📊  Diagram 7 — Crop Yield ML Pipeline  (Mermaid Diagram — renders in VS Code/GitHub/Notion)</w:t>
-            </w:r>
-          </w:p>
-        </w:tc>
-      </w:tr>
-    </w:tbl>
-    <w:p>
       <w:r>
         <w:rPr>
           <w:rFonts w:ascii="Calibri" w:hAnsi="Calibri"/>
           <w:i/>
+          <w:color w:val="3C3C3C"/>
           <w:sz w:val="20"/>
         </w:rPr>
-        <w:t>Full pipeline from raw agricultural data through training to Flask inference.</w:t>
+        <w:t>Full pipeline: raw images → augmentation → EfficientNet-B0 training (15 epochs) → saved model.</w:t>
+      </w:r>
+    </w:p>
+    <w:p/>
+    <w:p>
+      <w:pPr>
+        <w:jc w:val="center"/>
+      </w:pPr>
+      <w:r>
+        <w:drawing>
+          <wp:inline xmlns:a="http://schemas.openxmlformats.org/drawingml/2006/main" xmlns:pic="http://schemas.openxmlformats.org/drawingml/2006/picture">
+            <wp:extent cx="5303520" cy="2365300"/>
+            <wp:docPr id="6" name="Picture 6"/>
+            <wp:cNvGraphicFramePr>
+              <a:graphicFrameLocks noChangeAspect="1"/>
+            </wp:cNvGraphicFramePr>
+            <a:graphic>
+              <a:graphicData uri="http://schemas.openxmlformats.org/drawingml/2006/picture">
+                <pic:pic>
+                  <pic:nvPicPr>
+                    <pic:cNvPr id="0" name="07_ml_pipeline_yield.png"/>
+                    <pic:cNvPicPr/>
+                  </pic:nvPicPr>
+                  <pic:blipFill>
+                    <a:blip r:embed="rId14"/>
+                    <a:stretch>
+                      <a:fillRect/>
+                    </a:stretch>
+                  </pic:blipFill>
+                  <pic:spPr>
+                    <a:xfrm>
+                      <a:off x="0" y="0"/>
+                      <a:ext cx="5303520" cy="2365300"/>
+                    </a:xfrm>
+                    <a:prstGeom prst="rect"/>
+                  </pic:spPr>
+                </pic:pic>
+              </a:graphicData>
+            </a:graphic>
+          </wp:inline>
+        </w:drawing>
       </w:r>
     </w:p>
     <w:p>
       <w:pPr>
-        <w:ind w:left="340"/>
-        <w:shd w:fill="F0F4FF" w:val="clear"/>
+        <w:jc w:val="center"/>
       </w:pPr>
       <w:r>
         <w:rPr>
-          <w:rFonts w:ascii="Courier New" w:hAnsi="Courier New"/>
-          <w:color w:val="1E1E1E"/>
-          <w:sz w:val="17"/>
+          <w:rFonts w:ascii="Calibri" w:hAnsi="Calibri"/>
+          <w:i/>
+          <w:color w:val="505050"/>
+          <w:sz w:val="18"/>
         </w:rPr>
-        <w:t>flowchart LR</w:t>
-        <w:br/>
-        <w:t xml:space="preserve">    A2["Raw Agricultural Data\n~14978 district rows"] --&gt; B2["Filter: Rice/India"]</w:t>
-        <w:br/>
-        <w:t xml:space="preserve">    B2 --&gt; C2["State-Year Aggregation\nArea-weighted yield"]</w:t>
-        <w:br/>
-        <w:t xml:space="preserve">    C2 --&gt; D2["Lag Feature Engineering\nYield_t1/t2, Rainfall_t1/t2, Temp_t1"]</w:t>
-        <w:br/>
-        <w:t xml:space="preserve">    D2 --&gt; E2["995 clean samples\n20 states | 16 features"]</w:t>
-        <w:br/>
-        <w:t xml:space="preserve">    E2 --&gt; F2["Time-Based Split\nTrain 1968-2012 / Test 2013-2017"]</w:t>
-        <w:br/>
-        <w:t xml:space="preserve">    F2 --&gt; G2["Preprocess: LabelEncoder + StandardScaler"]</w:t>
-        <w:br/>
-        <w:t xml:space="preserve">    G2 --&gt; H2["Random Forest Regressor Training"]</w:t>
-        <w:br/>
-        <w:t xml:space="preserve">    H2 --&gt; I2["R²=0.9438 | RMSE=174.97 | MAPE=5.35%"]</w:t>
-        <w:br/>
-        <w:t xml:space="preserve">    I2 --&gt; J2["Save: yield_model.pkl + preprocessor.pkl"]</w:t>
-        <w:br/>
-        <w:t xml:space="preserve">    J2 --&gt; K2["Flask: 16-feature vector → predict → kg/ha → t/ha"]</w:t>
+        <w:t>Figure 7 — Crop Yield ML Pipeline</w:t>
+      </w:r>
+    </w:p>
+    <w:p>
+      <w:pPr>
+        <w:ind w:left="170"/>
+      </w:pPr>
+      <w:r>
+        <w:rPr>
+          <w:rFonts w:ascii="Calibri" w:hAnsi="Calibri"/>
+          <w:i/>
+          <w:color w:val="3C3C3C"/>
+          <w:sz w:val="20"/>
+        </w:rPr>
+        <w:t>Full pipeline: raw district data → aggregation → lag engineering → RF training → evaluation → serialisation.</w:t>
       </w:r>
     </w:p>
     <w:p/>
@@ -4047,6 +3783,166 @@
         <w:t>7. Application Architecture</w:t>
       </w:r>
     </w:p>
+    <w:p>
+      <w:pPr>
+        <w:jc w:val="center"/>
+      </w:pPr>
+      <w:r>
+        <w:drawing>
+          <wp:inline xmlns:a="http://schemas.openxmlformats.org/drawingml/2006/main" xmlns:pic="http://schemas.openxmlformats.org/drawingml/2006/picture">
+            <wp:extent cx="5303520" cy="3812005"/>
+            <wp:docPr id="7" name="Picture 7"/>
+            <wp:cNvGraphicFramePr>
+              <a:graphicFrameLocks noChangeAspect="1"/>
+            </wp:cNvGraphicFramePr>
+            <a:graphic>
+              <a:graphicData uri="http://schemas.openxmlformats.org/drawingml/2006/picture">
+                <pic:pic>
+                  <pic:nvPicPr>
+                    <pic:cNvPr id="0" name="05a_sequence_disease.png"/>
+                    <pic:cNvPicPr/>
+                  </pic:nvPicPr>
+                  <pic:blipFill>
+                    <a:blip r:embed="rId15"/>
+                    <a:stretch>
+                      <a:fillRect/>
+                    </a:stretch>
+                  </pic:blipFill>
+                  <pic:spPr>
+                    <a:xfrm>
+                      <a:off x="0" y="0"/>
+                      <a:ext cx="5303520" cy="3812005"/>
+                    </a:xfrm>
+                    <a:prstGeom prst="rect"/>
+                  </pic:spPr>
+                </pic:pic>
+              </a:graphicData>
+            </a:graphic>
+          </wp:inline>
+        </w:drawing>
+      </w:r>
+    </w:p>
+    <w:p>
+      <w:pPr>
+        <w:jc w:val="center"/>
+      </w:pPr>
+      <w:r>
+        <w:rPr>
+          <w:rFonts w:ascii="Calibri" w:hAnsi="Calibri"/>
+          <w:i/>
+          <w:color w:val="505050"/>
+          <w:sz w:val="18"/>
+        </w:rPr>
+        <w:t>Figure 5a — Sequence Diagram: Disease Prediction</w:t>
+      </w:r>
+    </w:p>
+    <w:p>
+      <w:pPr>
+        <w:ind w:left="170"/>
+      </w:pPr>
+      <w:r>
+        <w:rPr>
+          <w:rFonts w:ascii="Calibri" w:hAnsi="Calibri"/>
+          <w:i/>
+          <w:color w:val="3C3C3C"/>
+          <w:sz w:val="20"/>
+        </w:rPr>
+        <w:t>Time-ordered message flow: user uploads image → preprocessing → CNN inference → disease label displayed.</w:t>
+      </w:r>
+    </w:p>
+    <w:p/>
+    <w:p>
+      <w:pPr>
+        <w:jc w:val="center"/>
+      </w:pPr>
+      <w:r>
+        <w:drawing>
+          <wp:inline xmlns:a="http://schemas.openxmlformats.org/drawingml/2006/main" xmlns:pic="http://schemas.openxmlformats.org/drawingml/2006/picture">
+            <wp:extent cx="5303520" cy="3812005"/>
+            <wp:docPr id="8" name="Picture 8"/>
+            <wp:cNvGraphicFramePr>
+              <a:graphicFrameLocks noChangeAspect="1"/>
+            </wp:cNvGraphicFramePr>
+            <a:graphic>
+              <a:graphicData uri="http://schemas.openxmlformats.org/drawingml/2006/picture">
+                <pic:pic>
+                  <pic:nvPicPr>
+                    <pic:cNvPr id="0" name="05b_sequence_yield.png"/>
+                    <pic:cNvPicPr/>
+                  </pic:nvPicPr>
+                  <pic:blipFill>
+                    <a:blip r:embed="rId16"/>
+                    <a:stretch>
+                      <a:fillRect/>
+                    </a:stretch>
+                  </pic:blipFill>
+                  <pic:spPr>
+                    <a:xfrm>
+                      <a:off x="0" y="0"/>
+                      <a:ext cx="5303520" cy="3812005"/>
+                    </a:xfrm>
+                    <a:prstGeom prst="rect"/>
+                  </pic:spPr>
+                </pic:pic>
+              </a:graphicData>
+            </a:graphic>
+          </wp:inline>
+        </w:drawing>
+      </w:r>
+    </w:p>
+    <w:p>
+      <w:pPr>
+        <w:jc w:val="center"/>
+      </w:pPr>
+      <w:r>
+        <w:rPr>
+          <w:rFonts w:ascii="Calibri" w:hAnsi="Calibri"/>
+          <w:i/>
+          <w:color w:val="505050"/>
+          <w:sz w:val="18"/>
+        </w:rPr>
+        <w:t>Figure 5b — Sequence Diagram: Crop Yield Prediction</w:t>
+      </w:r>
+    </w:p>
+    <w:p>
+      <w:pPr>
+        <w:ind w:left="170"/>
+      </w:pPr>
+      <w:r>
+        <w:rPr>
+          <w:rFonts w:ascii="Calibri" w:hAnsi="Calibri"/>
+          <w:i/>
+          <w:color w:val="3C3C3C"/>
+          <w:sz w:val="20"/>
+        </w:rPr>
+        <w:t>Time-ordered flow: user enters 8 params → feature engineering → RF inference → unit conversion → yield displayed.</w:t>
+      </w:r>
+    </w:p>
+    <w:p/>
+    <w:p>
+      <w:pPr>
+        <w:pStyle w:val="Heading2"/>
+      </w:pPr>
+      <w:r>
+        <w:rPr>
+          <w:rFonts w:ascii="Calibri" w:hAnsi="Calibri"/>
+          <w:color w:val="4472C4"/>
+        </w:rPr>
+        <w:t>7.1 Class Structure (Backend)</w:t>
+      </w:r>
+    </w:p>
+    <w:p>
+      <w:pPr>
+        <w:ind w:left="0"/>
+      </w:pPr>
+      <w:r>
+        <w:rPr>
+          <w:rFonts w:ascii="Calibri" w:hAnsi="Calibri"/>
+          <w:sz w:val="22"/>
+        </w:rPr>
+        <w:t>The Flask application is organised into controller classes:</w:t>
+      </w:r>
+    </w:p>
     <w:tbl>
       <w:tblPr>
         <w:tblStyle w:val="TableGrid"/>
@@ -4054,12 +3950,13 @@
         <w:tblLook w:firstColumn="1" w:firstRow="1" w:lastColumn="0" w:lastRow="0" w:noHBand="0" w:noVBand="1" w:val="04A0"/>
       </w:tblPr>
       <w:tblGrid>
-        <w:gridCol w:w="9066"/>
+        <w:gridCol w:w="4533"/>
+        <w:gridCol w:w="4533"/>
       </w:tblGrid>
       <w:tr>
         <w:tc>
           <w:tcPr>
-            <w:tcW w:type="dxa" w:w="9066"/>
+            <w:tcW w:type="dxa" w:w="2268"/>
             <w:shd w:fill="1F497D" w:color="auto" w:val="clear"/>
           </w:tcPr>
           <w:p>
@@ -4071,85 +3968,13 @@
                 <w:color w:val="FFFFFF"/>
                 <w:sz w:val="20"/>
               </w:rPr>
-              <w:t>📊  Diagram 5a — Sequence Diagram (Disease Prediction)  (Mermaid Diagram — renders in VS Code/GitHub/Notion)</w:t>
+              <w:t>Class</w:t>
             </w:r>
           </w:p>
         </w:tc>
-      </w:tr>
-    </w:tbl>
-    <w:p>
-      <w:r>
-        <w:rPr>
-          <w:rFonts w:ascii="Calibri" w:hAnsi="Calibri"/>
-          <w:i/>
-          <w:sz w:val="20"/>
-        </w:rPr>
-        <w:t>Message flow from user image upload through CNN to result display.</w:t>
-      </w:r>
-    </w:p>
-    <w:p>
-      <w:pPr>
-        <w:ind w:left="340"/>
-        <w:shd w:fill="F0F4FF" w:val="clear"/>
-      </w:pPr>
-      <w:r>
-        <w:rPr>
-          <w:rFonts w:ascii="Courier New" w:hAnsi="Courier New"/>
-          <w:color w:val="1E1E1E"/>
-          <w:sz w:val="17"/>
-        </w:rPr>
-        <w:t>sequenceDiagram</w:t>
-        <w:br/>
-        <w:t xml:space="preserve">    actor User</w:t>
-        <w:br/>
-        <w:t xml:space="preserve">    participant Browser</w:t>
-        <w:br/>
-        <w:t xml:space="preserve">    participant Flask</w:t>
-        <w:br/>
-        <w:t xml:space="preserve">    participant Preprocessor</w:t>
-        <w:br/>
-        <w:t xml:space="preserve">    participant EfficientNet</w:t>
-        <w:br/>
-        <w:br/>
-        <w:t xml:space="preserve">    User-&gt;&gt;Browser: Navigate to /disease</w:t>
-        <w:br/>
-        <w:t xml:space="preserve">    Browser-&gt;&gt;Flask: GET /disease</w:t>
-        <w:br/>
-        <w:t xml:space="preserve">    Flask--&gt;&gt;Browser: Render disease.html</w:t>
-        <w:br/>
-        <w:t xml:space="preserve">    User-&gt;&gt;Browser: Select image, Submit</w:t>
-        <w:br/>
-        <w:t xml:space="preserve">    Browser-&gt;&gt;Flask: POST /predict-disease (multipart)</w:t>
-        <w:br/>
-        <w:t xml:space="preserve">    Flask-&gt;&gt;Preprocessor: Load, resize 224x224, preprocess_input()</w:t>
-        <w:br/>
-        <w:t xml:space="preserve">    Preprocessor--&gt;&gt;Flask: X (1x224x224x3)</w:t>
-        <w:br/>
-        <w:t xml:space="preserve">    Flask-&gt;&gt;EfficientNet: model.predict(X)</w:t>
-        <w:br/>
-        <w:t xml:space="preserve">    EfficientNet--&gt;&gt;Flask: probabilities [p0,p1,p2,p3]</w:t>
-        <w:br/>
-        <w:t xml:space="preserve">    Flask-&gt;&gt;Flask: argmax → label</w:t>
-        <w:br/>
-        <w:t xml:space="preserve">    Flask--&gt;&gt;Browser: Render result (disease + confidence%)</w:t>
-        <w:br/>
-        <w:t xml:space="preserve">    Browser--&gt;&gt;User: Display prediction</w:t>
-      </w:r>
-    </w:p>
-    <w:p/>
-    <w:tbl>
-      <w:tblPr>
-        <w:tblStyle w:val="TableGrid"/>
-        <w:tblW w:type="auto" w:w="0"/>
-        <w:tblLook w:firstColumn="1" w:firstRow="1" w:lastColumn="0" w:lastRow="0" w:noHBand="0" w:noVBand="1" w:val="04A0"/>
-      </w:tblPr>
-      <w:tblGrid>
-        <w:gridCol w:w="9066"/>
-      </w:tblGrid>
-      <w:tr>
         <w:tc>
           <w:tcPr>
-            <w:tcW w:type="dxa" w:w="9066"/>
+            <w:tcW w:type="dxa" w:w="7087"/>
             <w:shd w:fill="1F497D" w:color="auto" w:val="clear"/>
           </w:tcPr>
           <w:p>
@@ -4161,214 +3986,176 @@
                 <w:color w:val="FFFFFF"/>
                 <w:sz w:val="20"/>
               </w:rPr>
-              <w:t>📊  Diagram 5b — Sequence Diagram (Yield Prediction)  (Mermaid Diagram — renders in VS Code/GitHub/Notion)</w:t>
+              <w:t>Key Responsibilities</w:t>
             </w:r>
           </w:p>
         </w:tc>
       </w:tr>
-    </w:tbl>
-    <w:p>
-      <w:r>
-        <w:rPr>
-          <w:rFonts w:ascii="Calibri" w:hAnsi="Calibri"/>
-          <w:i/>
-          <w:sz w:val="20"/>
-        </w:rPr>
-        <w:t>Message flow from form submission through RF model to yield display.</w:t>
-      </w:r>
-    </w:p>
-    <w:p>
-      <w:pPr>
-        <w:ind w:left="340"/>
-        <w:shd w:fill="F0F4FF" w:val="clear"/>
-      </w:pPr>
-      <w:r>
-        <w:rPr>
-          <w:rFonts w:ascii="Courier New" w:hAnsi="Courier New"/>
-          <w:color w:val="1E1E1E"/>
-          <w:sz w:val="17"/>
-        </w:rPr>
-        <w:t>sequenceDiagram</w:t>
-        <w:br/>
-        <w:t xml:space="preserve">    actor User</w:t>
-        <w:br/>
-        <w:t xml:space="preserve">    participant Browser</w:t>
-        <w:br/>
-        <w:t xml:space="preserve">    participant Flask</w:t>
-        <w:br/>
-        <w:t xml:space="preserve">    participant FeatureEngineer</w:t>
-        <w:br/>
-        <w:t xml:space="preserve">    participant RFModel</w:t>
-        <w:br/>
-        <w:br/>
-        <w:t xml:space="preserve">    User-&gt;&gt;Browser: Navigate to /yield</w:t>
-        <w:br/>
-        <w:t xml:space="preserve">    Browser-&gt;&gt;Flask: GET /yield</w:t>
-        <w:br/>
-        <w:t xml:space="preserve">    Flask--&gt;&gt;Browser: Render yield.html</w:t>
-        <w:br/>
-        <w:t xml:space="preserve">    User-&gt;&gt;Browser: Enter State, N, P, K, Temp, Humidity, Rainfall, pH</w:t>
-        <w:br/>
-        <w:t xml:space="preserve">    Browser-&gt;&gt;Flask: POST /predict-yield (form data)</w:t>
-        <w:br/>
-        <w:t xml:space="preserve">    Flask-&gt;&gt;FeatureEngineer: parse + encode State</w:t>
-        <w:br/>
-        <w:t xml:space="preserve">    FeatureEngineer-&gt;&gt;FeatureEngineer: inject defaults (Year, Wind, Solar)</w:t>
-        <w:br/>
-        <w:t xml:space="preserve">    FeatureEngineer-&gt;&gt;FeatureEngineer: compute lags (Yield_t1, Rainfall_t1, Temp_t1)</w:t>
-        <w:br/>
-        <w:t xml:space="preserve">    FeatureEngineer-&gt;&gt;FeatureEngineer: StandardScaler transform</w:t>
-        <w:br/>
-        <w:t xml:space="preserve">    FeatureEngineer--&gt;&gt;Flask: X_vector (1x16)</w:t>
-        <w:br/>
-        <w:t xml:space="preserve">    Flask-&gt;&gt;RFModel: model.predict(X_vector)</w:t>
-        <w:br/>
-        <w:t xml:space="preserve">    RFModel--&gt;&gt;Flask: yield_kg_ha</w:t>
-        <w:br/>
-        <w:t xml:space="preserve">    Flask-&gt;&gt;Flask: yield_kg_ha / 1000 = yield_t_ha</w:t>
-        <w:br/>
-        <w:t xml:space="preserve">    Flask--&gt;&gt;Browser: Render result (kg/ha + t/ha)</w:t>
-        <w:br/>
-        <w:t xml:space="preserve">    Browser--&gt;&gt;User: Display predicted yield</w:t>
-      </w:r>
-    </w:p>
-    <w:p/>
-    <w:tbl>
-      <w:tblPr>
-        <w:tblStyle w:val="TableGrid"/>
-        <w:tblW w:type="auto" w:w="0"/>
-        <w:tblLook w:firstColumn="1" w:firstRow="1" w:lastColumn="0" w:lastRow="0" w:noHBand="0" w:noVBand="1" w:val="04A0"/>
-      </w:tblPr>
-      <w:tblGrid>
-        <w:gridCol w:w="9066"/>
-      </w:tblGrid>
       <w:tr>
         <w:tc>
           <w:tcPr>
-            <w:tcW w:type="dxa" w:w="9066"/>
-            <w:shd w:fill="1F497D" w:color="auto" w:val="clear"/>
+            <w:tcW w:type="dxa" w:w="2268"/>
           </w:tcPr>
           <w:p>
             <w:r/>
             <w:r>
               <w:rPr>
                 <w:rFonts w:ascii="Calibri" w:hAnsi="Calibri"/>
-                <w:b/>
-                <w:color w:val="FFFFFF"/>
                 <w:sz w:val="20"/>
               </w:rPr>
-              <w:t>📊  Diagram 9 — Class Diagram (Backend)  (Mermaid Diagram — renders in VS Code/GitHub/Notion)</w:t>
+              <w:t>FlaskApp</w:t>
+            </w:r>
+          </w:p>
+        </w:tc>
+        <w:tc>
+          <w:tcPr>
+            <w:tcW w:type="dxa" w:w="7087"/>
+          </w:tcPr>
+          <w:p>
+            <w:r/>
+            <w:r>
+              <w:rPr>
+                <w:rFonts w:ascii="Calibri" w:hAnsi="Calibri"/>
+                <w:sz w:val="20"/>
+              </w:rPr>
+              <w:t>Loads both models at startup; runs the web server</w:t>
+            </w:r>
+          </w:p>
+        </w:tc>
+      </w:tr>
+      <w:tr>
+        <w:tc>
+          <w:tcPr>
+            <w:tcW w:type="dxa" w:w="2268"/>
+            <w:shd w:fill="DCE6F1" w:color="auto" w:val="clear"/>
+          </w:tcPr>
+          <w:p>
+            <w:r/>
+            <w:r>
+              <w:rPr>
+                <w:rFonts w:ascii="Calibri" w:hAnsi="Calibri"/>
+                <w:sz w:val="20"/>
+              </w:rPr>
+              <w:t>DiseaseController</w:t>
+            </w:r>
+          </w:p>
+        </w:tc>
+        <w:tc>
+          <w:tcPr>
+            <w:tcW w:type="dxa" w:w="7087"/>
+            <w:shd w:fill="DCE6F1" w:color="auto" w:val="clear"/>
+          </w:tcPr>
+          <w:p>
+            <w:r/>
+            <w:r>
+              <w:rPr>
+                <w:rFonts w:ascii="Calibri" w:hAnsi="Calibri"/>
+                <w:sz w:val="20"/>
+              </w:rPr>
+              <w:t>Handles /disease routes; calls ImagePreprocessor and EfficientNet</w:t>
+            </w:r>
+          </w:p>
+        </w:tc>
+      </w:tr>
+      <w:tr>
+        <w:tc>
+          <w:tcPr>
+            <w:tcW w:type="dxa" w:w="2268"/>
+          </w:tcPr>
+          <w:p>
+            <w:r/>
+            <w:r>
+              <w:rPr>
+                <w:rFonts w:ascii="Calibri" w:hAnsi="Calibri"/>
+                <w:sz w:val="20"/>
+              </w:rPr>
+              <w:t>YieldController</w:t>
+            </w:r>
+          </w:p>
+        </w:tc>
+        <w:tc>
+          <w:tcPr>
+            <w:tcW w:type="dxa" w:w="7087"/>
+          </w:tcPr>
+          <w:p>
+            <w:r/>
+            <w:r>
+              <w:rPr>
+                <w:rFonts w:ascii="Calibri" w:hAnsi="Calibri"/>
+                <w:sz w:val="20"/>
+              </w:rPr>
+              <w:t>Handles /yield routes; calls FeatureEngineer and RF model; converts units</w:t>
+            </w:r>
+          </w:p>
+        </w:tc>
+      </w:tr>
+      <w:tr>
+        <w:tc>
+          <w:tcPr>
+            <w:tcW w:type="dxa" w:w="2268"/>
+            <w:shd w:fill="DCE6F1" w:color="auto" w:val="clear"/>
+          </w:tcPr>
+          <w:p>
+            <w:r/>
+            <w:r>
+              <w:rPr>
+                <w:rFonts w:ascii="Calibri" w:hAnsi="Calibri"/>
+                <w:sz w:val="20"/>
+              </w:rPr>
+              <w:t>ImagePreprocessor</w:t>
+            </w:r>
+          </w:p>
+        </w:tc>
+        <w:tc>
+          <w:tcPr>
+            <w:tcW w:type="dxa" w:w="7087"/>
+            <w:shd w:fill="DCE6F1" w:color="auto" w:val="clear"/>
+          </w:tcPr>
+          <w:p>
+            <w:r/>
+            <w:r>
+              <w:rPr>
+                <w:rFonts w:ascii="Calibri" w:hAnsi="Calibri"/>
+                <w:sz w:val="20"/>
+              </w:rPr>
+              <w:t>Loads image with Pillow, resizes to 224×224, applies efficientnet preprocessing</w:t>
+            </w:r>
+          </w:p>
+        </w:tc>
+      </w:tr>
+      <w:tr>
+        <w:tc>
+          <w:tcPr>
+            <w:tcW w:type="dxa" w:w="2268"/>
+          </w:tcPr>
+          <w:p>
+            <w:r/>
+            <w:r>
+              <w:rPr>
+                <w:rFonts w:ascii="Calibri" w:hAnsi="Calibri"/>
+                <w:sz w:val="20"/>
+              </w:rPr>
+              <w:t>FeatureEngineer</w:t>
+            </w:r>
+          </w:p>
+        </w:tc>
+        <w:tc>
+          <w:tcPr>
+            <w:tcW w:type="dxa" w:w="7087"/>
+          </w:tcPr>
+          <w:p>
+            <w:r/>
+            <w:r>
+              <w:rPr>
+                <w:rFonts w:ascii="Calibri" w:hAnsi="Calibri"/>
+                <w:sz w:val="20"/>
+              </w:rPr>
+              <w:t>Encodes state, injects defaults, computes lags, applies StandardScaler</w:t>
             </w:r>
           </w:p>
         </w:tc>
       </w:tr>
     </w:tbl>
-    <w:p>
-      <w:r>
-        <w:rPr>
-          <w:rFonts w:ascii="Calibri" w:hAnsi="Calibri"/>
-          <w:i/>
-          <w:sz w:val="20"/>
-        </w:rPr>
-        <w:t>Object-oriented structure of the Flask application backend.</w:t>
-      </w:r>
-    </w:p>
-    <w:p>
-      <w:pPr>
-        <w:ind w:left="340"/>
-        <w:shd w:fill="F0F4FF" w:val="clear"/>
-      </w:pPr>
-      <w:r>
-        <w:rPr>
-          <w:rFonts w:ascii="Courier New" w:hAnsi="Courier New"/>
-          <w:color w:val="1E1E1E"/>
-          <w:sz w:val="17"/>
-        </w:rPr>
-        <w:t>classDiagram</w:t>
-        <w:br/>
-        <w:t xml:space="preserve">    class FlaskApp {</w:t>
-        <w:br/>
-        <w:t xml:space="preserve">        +disease_model: tf.Model</w:t>
-        <w:br/>
-        <w:t xml:space="preserve">        +rf_model: RandomForestRegressor</w:t>
-        <w:br/>
-        <w:t xml:space="preserve">        +preprocessor: ColumnTransformer</w:t>
-        <w:br/>
-        <w:t xml:space="preserve">        +load_models()</w:t>
-        <w:br/>
-        <w:t xml:space="preserve">        +run()</w:t>
-        <w:br/>
-        <w:t xml:space="preserve">    }</w:t>
-        <w:br/>
-        <w:t xml:space="preserve">    class DiseaseController {</w:t>
-        <w:br/>
-        <w:t xml:space="preserve">        +CLASS_LABELS: list</w:t>
-        <w:br/>
-        <w:t xml:space="preserve">        +render_form() Response</w:t>
-        <w:br/>
-        <w:t xml:space="preserve">        +predict_disease(image) Response</w:t>
-        <w:br/>
-        <w:t xml:space="preserve">        -save_image(file) str</w:t>
-        <w:br/>
-        <w:t xml:space="preserve">        -preprocess_image(path) ndarray</w:t>
-        <w:br/>
-        <w:t xml:space="preserve">        -run_inference(X) tuple</w:t>
-        <w:br/>
-        <w:t xml:space="preserve">    }</w:t>
-        <w:br/>
-        <w:t xml:space="preserve">    class YieldController {</w:t>
-        <w:br/>
-        <w:t xml:space="preserve">        +FEATURE_COLUMNS: list</w:t>
-        <w:br/>
-        <w:t xml:space="preserve">        +render_form() Response</w:t>
-        <w:br/>
-        <w:t xml:space="preserve">        +predict_yield(form_data) Response</w:t>
-        <w:br/>
-        <w:t xml:space="preserve">        -parse_inputs(form) dict</w:t>
-        <w:br/>
-        <w:t xml:space="preserve">        -inject_defaults(features) dict</w:t>
-        <w:br/>
-        <w:t xml:space="preserve">        -build_feature_vector(f) ndarray</w:t>
-        <w:br/>
-        <w:t xml:space="preserve">        -convert_units(kg_ha) float</w:t>
-        <w:br/>
-        <w:t xml:space="preserve">    }</w:t>
-        <w:br/>
-        <w:t xml:space="preserve">    class ImagePreprocessor {</w:t>
-        <w:br/>
-        <w:t xml:space="preserve">        +IMG_SIZE: int = 224</w:t>
-        <w:br/>
-        <w:t xml:space="preserve">        +load(path) Image</w:t>
-        <w:br/>
-        <w:t xml:space="preserve">        +resize(img) Image</w:t>
-        <w:br/>
-        <w:t xml:space="preserve">        +preprocess(img) ndarray</w:t>
-        <w:br/>
-        <w:t xml:space="preserve">    }</w:t>
-        <w:br/>
-        <w:t xml:space="preserve">    class FeatureEngineer {</w:t>
-        <w:br/>
-        <w:t xml:space="preserve">        +DEFAULTS: dict</w:t>
-        <w:br/>
-        <w:t xml:space="preserve">        +encode_state(state) int</w:t>
-        <w:br/>
-        <w:t xml:space="preserve">        +compute_lags(r, t) dict</w:t>
-        <w:br/>
-        <w:t xml:space="preserve">        +build_vector(inputs) ndarray</w:t>
-        <w:br/>
-        <w:t xml:space="preserve">        +scale(X) ndarray</w:t>
-        <w:br/>
-        <w:t xml:space="preserve">    }</w:t>
-        <w:br/>
-        <w:t xml:space="preserve">    FlaskApp --&gt; DiseaseController</w:t>
-        <w:br/>
-        <w:t xml:space="preserve">    FlaskApp --&gt; YieldController</w:t>
-        <w:br/>
-        <w:t xml:space="preserve">    DiseaseController --&gt; ImagePreprocessor</w:t>
-        <w:br/>
-        <w:t xml:space="preserve">    YieldController --&gt; FeatureEngineer</w:t>
-      </w:r>
-    </w:p>
     <w:p/>
     <w:p>
       <w:pPr>
@@ -4382,110 +4169,71 @@
         <w:t>8. Deployment Architecture</w:t>
       </w:r>
     </w:p>
-    <w:tbl>
-      <w:tblPr>
-        <w:tblStyle w:val="TableGrid"/>
-        <w:tblW w:type="auto" w:w="0"/>
-        <w:tblLook w:firstColumn="1" w:firstRow="1" w:lastColumn="0" w:lastRow="0" w:noHBand="0" w:noVBand="1" w:val="04A0"/>
-      </w:tblPr>
-      <w:tblGrid>
-        <w:gridCol w:w="9066"/>
-      </w:tblGrid>
-      <w:tr>
-        <w:tc>
-          <w:tcPr>
-            <w:tcW w:type="dxa" w:w="9066"/>
-            <w:shd w:fill="1F497D" w:color="auto" w:val="clear"/>
-          </w:tcPr>
-          <w:p>
-            <w:r/>
-            <w:r>
-              <w:rPr>
-                <w:rFonts w:ascii="Calibri" w:hAnsi="Calibri"/>
-                <w:b/>
-                <w:color w:val="FFFFFF"/>
-                <w:sz w:val="20"/>
-              </w:rPr>
-              <w:t>📊  Diagram 7 — Deployment Diagram  (Mermaid Diagram — renders in VS Code/GitHub/Notion)</w:t>
-            </w:r>
-          </w:p>
-        </w:tc>
-      </w:tr>
-    </w:tbl>
     <w:p>
+      <w:pPr>
+        <w:jc w:val="center"/>
+      </w:pPr>
+      <w:r>
+        <w:drawing>
+          <wp:inline xmlns:a="http://schemas.openxmlformats.org/drawingml/2006/main" xmlns:pic="http://schemas.openxmlformats.org/drawingml/2006/picture">
+            <wp:extent cx="5303520" cy="3812005"/>
+            <wp:docPr id="9" name="Picture 9"/>
+            <wp:cNvGraphicFramePr>
+              <a:graphicFrameLocks noChangeAspect="1"/>
+            </wp:cNvGraphicFramePr>
+            <a:graphic>
+              <a:graphicData uri="http://schemas.openxmlformats.org/drawingml/2006/picture">
+                <pic:pic>
+                  <pic:nvPicPr>
+                    <pic:cNvPr id="0" name="09_deployment.png"/>
+                    <pic:cNvPicPr/>
+                  </pic:nvPicPr>
+                  <pic:blipFill>
+                    <a:blip r:embed="rId17"/>
+                    <a:stretch>
+                      <a:fillRect/>
+                    </a:stretch>
+                  </pic:blipFill>
+                  <pic:spPr>
+                    <a:xfrm>
+                      <a:off x="0" y="0"/>
+                      <a:ext cx="5303520" cy="3812005"/>
+                    </a:xfrm>
+                    <a:prstGeom prst="rect"/>
+                  </pic:spPr>
+                </pic:pic>
+              </a:graphicData>
+            </a:graphic>
+          </wp:inline>
+        </w:drawing>
+      </w:r>
+    </w:p>
+    <w:p>
+      <w:pPr>
+        <w:jc w:val="center"/>
+      </w:pPr>
       <w:r>
         <w:rPr>
           <w:rFonts w:ascii="Calibri" w:hAnsi="Calibri"/>
           <w:i/>
-          <w:sz w:val="20"/>
+          <w:color w:val="505050"/>
+          <w:sz w:val="18"/>
         </w:rPr>
-        <w:t>Physical deployment: client browser → Flask server → model files on filesystem.</w:t>
+        <w:t>Figure 9 — Deployment Diagram</w:t>
       </w:r>
     </w:p>
     <w:p>
       <w:pPr>
-        <w:ind w:left="340"/>
-        <w:shd w:fill="F0F4FF" w:val="clear"/>
+        <w:ind w:left="170"/>
       </w:pPr>
       <w:r>
         <w:rPr>
-          <w:rFonts w:ascii="Courier New" w:hAnsi="Courier New"/>
-          <w:color w:val="1E1E1E"/>
-          <w:sz w:val="17"/>
+          <w:rFonts w:ascii="Calibri" w:hAnsi="Calibri"/>
+          <w:i/>
+          <w:color w:val="3C3C3C"/>
+          <w:sz w:val="20"/>
         </w:rPr>
-        <w:t>graph TB</w:t>
-        <w:br/>
-        <w:t xml:space="preserve">    subgraph CLIENT["Client Machine"]</w:t>
-        <w:br/>
-        <w:t xml:space="preserve">        BROWSER["Web Browser\nlocalhost:5000"]</w:t>
-        <w:br/>
-        <w:t xml:space="preserve">    end</w:t>
-        <w:br/>
-        <w:t xml:space="preserve">    subgraph SERVER["Development Server (Local)"]</w:t>
-        <w:br/>
-        <w:t xml:space="preserve">        subgraph FLASK["Flask Application Process"]</w:t>
-        <w:br/>
-        <w:t xml:space="preserve">            ROUTER["URL Router"]</w:t>
-        <w:br/>
-        <w:t xml:space="preserve">            DC["Disease Controller"]</w:t>
-        <w:br/>
-        <w:t xml:space="preserve">            YC["Yield Controller"]</w:t>
-        <w:br/>
-        <w:t xml:space="preserve">            CNN3["EfficientNet-B0 (in-memory)"]</w:t>
-        <w:br/>
-        <w:t xml:space="preserve">            RF3["Random Forest (in-memory)"]</w:t>
-        <w:br/>
-        <w:t xml:space="preserve">            TMPL["Jinja2 Templates"]</w:t>
-        <w:br/>
-        <w:t xml:space="preserve">        end</w:t>
-        <w:br/>
-        <w:t xml:space="preserve">        subgraph FS["Filesystem"]</w:t>
-        <w:br/>
-        <w:t xml:space="preserve">            UPL["uploads/"]</w:t>
-        <w:br/>
-        <w:t xml:space="preserve">            MDL["models/ (.h5 + .pkl)"]</w:t>
-        <w:br/>
-        <w:t xml:space="preserve">            STC["static/ (CSS/JS)"]</w:t>
-        <w:br/>
-        <w:t xml:space="preserve">        end</w:t>
-        <w:br/>
-        <w:t xml:space="preserve">    end</w:t>
-        <w:br/>
-        <w:t xml:space="preserve">    BROWSER --&gt;|"HTTP GET/POST"| ROUTER</w:t>
-        <w:br/>
-        <w:t xml:space="preserve">    ROUTER --&gt; DC &amp; YC</w:t>
-        <w:br/>
-        <w:t xml:space="preserve">    DC --&gt; CNN3</w:t>
-        <w:br/>
-        <w:t xml:space="preserve">    YC --&gt; RF3</w:t>
-        <w:br/>
-        <w:t xml:space="preserve">    ROUTER --&gt; TMPL --&gt; BROWSER</w:t>
-        <w:br/>
-        <w:t xml:space="preserve">    DC &lt;--&gt; UPL</w:t>
-        <w:br/>
-        <w:t xml:space="preserve">    CNN3 &amp; RF3 --&gt;|"startup load"| MDL</w:t>
-        <w:br/>
-        <w:t xml:space="preserve">    TMPL &lt;--&gt; STC</w:t>
+        <w:t>Client browser → Flask process (router + controllers + in-memory models) → local filesystem.</w:t>
       </w:r>
     </w:p>
     <w:p/>
@@ -4582,7 +4330,7 @@
                 <w:rFonts w:ascii="Calibri" w:hAnsi="Calibri"/>
                 <w:sz w:val="20"/>
               </w:rPr>
-              <w:t>Web Framework</w:t>
+              <w:t>Web Server</w:t>
             </w:r>
           </w:p>
         </w:tc>
@@ -4598,7 +4346,7 @@
                 <w:rFonts w:ascii="Calibri" w:hAnsi="Calibri"/>
                 <w:sz w:val="20"/>
               </w:rPr>
-              <w:t>Flask (Werkzeug dev server)</w:t>
+              <w:t>Flask/Werkzeug dev server</w:t>
             </w:r>
           </w:p>
         </w:tc>
@@ -4648,7 +4396,7 @@
                 <w:rFonts w:ascii="Calibri" w:hAnsi="Calibri"/>
                 <w:sz w:val="20"/>
               </w:rPr>
-              <w:t>Debug Mode</w:t>
+              <w:t>Debug</w:t>
             </w:r>
           </w:p>
         </w:tc>
@@ -4681,7 +4429,7 @@
                 <w:rFonts w:ascii="Calibri" w:hAnsi="Calibri"/>
                 <w:sz w:val="20"/>
               </w:rPr>
-              <w:t>Model Loading</w:t>
+              <w:t>Model loading</w:t>
             </w:r>
           </w:p>
         </w:tc>
@@ -4696,7 +4444,7 @@
                 <w:rFonts w:ascii="Calibri" w:hAnsi="Calibri"/>
                 <w:sz w:val="20"/>
               </w:rPr>
-              <w:t>At application startup — loaded once, shared in-memory</w:t>
+              <w:t>At application startup — loaded once, held in process memory</w:t>
             </w:r>
           </w:p>
         </w:tc>
@@ -4714,7 +4462,7 @@
                 <w:rFonts w:ascii="Calibri" w:hAnsi="Calibri"/>
                 <w:sz w:val="20"/>
               </w:rPr>
-              <w:t>Max Upload Size</w:t>
+              <w:t>Max upload</w:t>
             </w:r>
           </w:p>
         </w:tc>
@@ -4816,15 +4564,98 @@
       </w:r>
     </w:p>
     <w:p>
+      <w:pPr>
+        <w:ind w:left="0"/>
+      </w:pPr>
       <w:r>
         <w:rPr>
           <w:rFonts w:ascii="Calibri" w:hAnsi="Calibri"/>
           <w:sz w:val="22"/>
         </w:rPr>
-        <w:t>The current implementation uses the filesystem for temporary storage. The following relational schema is defined for production readiness and future implementation.</w:t>
+        <w:t>Current implementation uses filesystem storage. The relational schema below is defined for production readiness.</w:t>
       </w:r>
     </w:p>
     <w:p/>
+    <w:p>
+      <w:pPr>
+        <w:jc w:val="center"/>
+      </w:pPr>
+      <w:r>
+        <w:drawing>
+          <wp:inline xmlns:a="http://schemas.openxmlformats.org/drawingml/2006/main" xmlns:pic="http://schemas.openxmlformats.org/drawingml/2006/picture">
+            <wp:extent cx="5303520" cy="3812005"/>
+            <wp:docPr id="10" name="Picture 10"/>
+            <wp:cNvGraphicFramePr>
+              <a:graphicFrameLocks noChangeAspect="1"/>
+            </wp:cNvGraphicFramePr>
+            <a:graphic>
+              <a:graphicData uri="http://schemas.openxmlformats.org/drawingml/2006/picture">
+                <pic:pic>
+                  <pic:nvPicPr>
+                    <pic:cNvPr id="0" name="08_er_diagram.png"/>
+                    <pic:cNvPicPr/>
+                  </pic:nvPicPr>
+                  <pic:blipFill>
+                    <a:blip r:embed="rId18"/>
+                    <a:stretch>
+                      <a:fillRect/>
+                    </a:stretch>
+                  </pic:blipFill>
+                  <pic:spPr>
+                    <a:xfrm>
+                      <a:off x="0" y="0"/>
+                      <a:ext cx="5303520" cy="3812005"/>
+                    </a:xfrm>
+                    <a:prstGeom prst="rect"/>
+                  </pic:spPr>
+                </pic:pic>
+              </a:graphicData>
+            </a:graphic>
+          </wp:inline>
+        </w:drawing>
+      </w:r>
+    </w:p>
+    <w:p>
+      <w:pPr>
+        <w:jc w:val="center"/>
+      </w:pPr>
+      <w:r>
+        <w:rPr>
+          <w:rFonts w:ascii="Calibri" w:hAnsi="Calibri"/>
+          <w:i/>
+          <w:color w:val="505050"/>
+          <w:sz w:val="18"/>
+        </w:rPr>
+        <w:t>Figure 8 — Entity-Relationship (ER) Diagram</w:t>
+      </w:r>
+    </w:p>
+    <w:p>
+      <w:pPr>
+        <w:ind w:left="170"/>
+      </w:pPr>
+      <w:r>
+        <w:rPr>
+          <w:rFonts w:ascii="Calibri" w:hAnsi="Calibri"/>
+          <w:i/>
+          <w:color w:val="3C3C3C"/>
+          <w:sz w:val="20"/>
+        </w:rPr>
+        <w:t>Entities: PredictionRequest, DiseasePrediction, YieldPrediction, UploadedImage with cardinality relationships.</w:t>
+      </w:r>
+    </w:p>
+    <w:p/>
+    <w:p>
+      <w:pPr>
+        <w:pStyle w:val="Heading2"/>
+      </w:pPr>
+      <w:r>
+        <w:rPr>
+          <w:rFonts w:ascii="Calibri" w:hAnsi="Calibri"/>
+          <w:color w:val="4472C4"/>
+        </w:rPr>
+        <w:t>Schema Summary</w:t>
+      </w:r>
+    </w:p>
     <w:tbl>
       <w:tblPr>
         <w:tblStyle w:val="TableGrid"/>
@@ -4832,12 +4663,15 @@
         <w:tblLook w:firstColumn="1" w:firstRow="1" w:lastColumn="0" w:lastRow="0" w:noHBand="0" w:noVBand="1" w:val="04A0"/>
       </w:tblPr>
       <w:tblGrid>
-        <w:gridCol w:w="9066"/>
+        <w:gridCol w:w="2266"/>
+        <w:gridCol w:w="2266"/>
+        <w:gridCol w:w="2266"/>
+        <w:gridCol w:w="2266"/>
       </w:tblGrid>
       <w:tr>
         <w:tc>
           <w:tcPr>
-            <w:tcW w:type="dxa" w:w="9066"/>
+            <w:tcW w:type="dxa" w:w="2268"/>
             <w:shd w:fill="1F497D" w:color="auto" w:val="clear"/>
           </w:tcPr>
           <w:p>
@@ -4849,114 +4683,322 @@
                 <w:color w:val="FFFFFF"/>
                 <w:sz w:val="20"/>
               </w:rPr>
-              <w:t>📊  Diagram 8 — ER Diagram  (Mermaid Diagram — renders in VS Code/GitHub/Notion)</w:t>
+              <w:t>Table</w:t>
+            </w:r>
+          </w:p>
+        </w:tc>
+        <w:tc>
+          <w:tcPr>
+            <w:tcW w:type="dxa" w:w="1701"/>
+            <w:shd w:fill="1F497D" w:color="auto" w:val="clear"/>
+          </w:tcPr>
+          <w:p>
+            <w:r/>
+            <w:r>
+              <w:rPr>
+                <w:rFonts w:ascii="Calibri" w:hAnsi="Calibri"/>
+                <w:b/>
+                <w:color w:val="FFFFFF"/>
+                <w:sz w:val="20"/>
+              </w:rPr>
+              <w:t>Primary Key</w:t>
+            </w:r>
+          </w:p>
+        </w:tc>
+        <w:tc>
+          <w:tcPr>
+            <w:tcW w:type="dxa" w:w="1984"/>
+            <w:shd w:fill="1F497D" w:color="auto" w:val="clear"/>
+          </w:tcPr>
+          <w:p>
+            <w:r/>
+            <w:r>
+              <w:rPr>
+                <w:rFonts w:ascii="Calibri" w:hAnsi="Calibri"/>
+                <w:b/>
+                <w:color w:val="FFFFFF"/>
+                <w:sz w:val="20"/>
+              </w:rPr>
+              <w:t>Foreign Keys</w:t>
+            </w:r>
+          </w:p>
+        </w:tc>
+        <w:tc>
+          <w:tcPr>
+            <w:tcW w:type="dxa" w:w="3402"/>
+            <w:shd w:fill="1F497D" w:color="auto" w:val="clear"/>
+          </w:tcPr>
+          <w:p>
+            <w:r/>
+            <w:r>
+              <w:rPr>
+                <w:rFonts w:ascii="Calibri" w:hAnsi="Calibri"/>
+                <w:b/>
+                <w:color w:val="FFFFFF"/>
+                <w:sz w:val="20"/>
+              </w:rPr>
+              <w:t>Key Columns</w:t>
+            </w:r>
+          </w:p>
+        </w:tc>
+      </w:tr>
+      <w:tr>
+        <w:tc>
+          <w:tcPr>
+            <w:tcW w:type="dxa" w:w="2268"/>
+          </w:tcPr>
+          <w:p>
+            <w:r/>
+            <w:r>
+              <w:rPr>
+                <w:rFonts w:ascii="Calibri" w:hAnsi="Calibri"/>
+                <w:sz w:val="20"/>
+              </w:rPr>
+              <w:t>prediction_requests</w:t>
+            </w:r>
+          </w:p>
+        </w:tc>
+        <w:tc>
+          <w:tcPr>
+            <w:tcW w:type="dxa" w:w="1701"/>
+          </w:tcPr>
+          <w:p>
+            <w:r/>
+            <w:r>
+              <w:rPr>
+                <w:rFonts w:ascii="Calibri" w:hAnsi="Calibri"/>
+                <w:sz w:val="20"/>
+              </w:rPr>
+              <w:t>request_id</w:t>
+            </w:r>
+          </w:p>
+        </w:tc>
+        <w:tc>
+          <w:tcPr>
+            <w:tcW w:type="dxa" w:w="1984"/>
+          </w:tcPr>
+          <w:p>
+            <w:r/>
+            <w:r>
+              <w:rPr>
+                <w:rFonts w:ascii="Calibri" w:hAnsi="Calibri"/>
+                <w:sz w:val="20"/>
+              </w:rPr>
+              <w:t>—</w:t>
+            </w:r>
+          </w:p>
+        </w:tc>
+        <w:tc>
+          <w:tcPr>
+            <w:tcW w:type="dxa" w:w="3402"/>
+          </w:tcPr>
+          <w:p>
+            <w:r/>
+            <w:r>
+              <w:rPr>
+                <w:rFonts w:ascii="Calibri" w:hAnsi="Calibri"/>
+                <w:sz w:val="20"/>
+              </w:rPr>
+              <w:t>session_id, module_type, timestamp</w:t>
+            </w:r>
+          </w:p>
+        </w:tc>
+      </w:tr>
+      <w:tr>
+        <w:tc>
+          <w:tcPr>
+            <w:tcW w:type="dxa" w:w="2268"/>
+            <w:shd w:fill="DCE6F1" w:color="auto" w:val="clear"/>
+          </w:tcPr>
+          <w:p>
+            <w:r/>
+            <w:r>
+              <w:rPr>
+                <w:rFonts w:ascii="Calibri" w:hAnsi="Calibri"/>
+                <w:sz w:val="20"/>
+              </w:rPr>
+              <w:t>disease_predictions</w:t>
+            </w:r>
+          </w:p>
+        </w:tc>
+        <w:tc>
+          <w:tcPr>
+            <w:tcW w:type="dxa" w:w="1701"/>
+            <w:shd w:fill="DCE6F1" w:color="auto" w:val="clear"/>
+          </w:tcPr>
+          <w:p>
+            <w:r/>
+            <w:r>
+              <w:rPr>
+                <w:rFonts w:ascii="Calibri" w:hAnsi="Calibri"/>
+                <w:sz w:val="20"/>
+              </w:rPr>
+              <w:t>disease_pred_id</w:t>
+            </w:r>
+          </w:p>
+        </w:tc>
+        <w:tc>
+          <w:tcPr>
+            <w:tcW w:type="dxa" w:w="1984"/>
+            <w:shd w:fill="DCE6F1" w:color="auto" w:val="clear"/>
+          </w:tcPr>
+          <w:p>
+            <w:r/>
+            <w:r>
+              <w:rPr>
+                <w:rFonts w:ascii="Calibri" w:hAnsi="Calibri"/>
+                <w:sz w:val="20"/>
+              </w:rPr>
+              <w:t>request_id</w:t>
+            </w:r>
+          </w:p>
+        </w:tc>
+        <w:tc>
+          <w:tcPr>
+            <w:tcW w:type="dxa" w:w="3402"/>
+            <w:shd w:fill="DCE6F1" w:color="auto" w:val="clear"/>
+          </w:tcPr>
+          <w:p>
+            <w:r/>
+            <w:r>
+              <w:rPr>
+                <w:rFonts w:ascii="Calibri" w:hAnsi="Calibri"/>
+                <w:sz w:val="20"/>
+              </w:rPr>
+              <w:t>image_filename, predicted_class, confidence_score</w:t>
+            </w:r>
+          </w:p>
+        </w:tc>
+      </w:tr>
+      <w:tr>
+        <w:tc>
+          <w:tcPr>
+            <w:tcW w:type="dxa" w:w="2268"/>
+          </w:tcPr>
+          <w:p>
+            <w:r/>
+            <w:r>
+              <w:rPr>
+                <w:rFonts w:ascii="Calibri" w:hAnsi="Calibri"/>
+                <w:sz w:val="20"/>
+              </w:rPr>
+              <w:t>yield_predictions</w:t>
+            </w:r>
+          </w:p>
+        </w:tc>
+        <w:tc>
+          <w:tcPr>
+            <w:tcW w:type="dxa" w:w="1701"/>
+          </w:tcPr>
+          <w:p>
+            <w:r/>
+            <w:r>
+              <w:rPr>
+                <w:rFonts w:ascii="Calibri" w:hAnsi="Calibri"/>
+                <w:sz w:val="20"/>
+              </w:rPr>
+              <w:t>yield_pred_id</w:t>
+            </w:r>
+          </w:p>
+        </w:tc>
+        <w:tc>
+          <w:tcPr>
+            <w:tcW w:type="dxa" w:w="1984"/>
+          </w:tcPr>
+          <w:p>
+            <w:r/>
+            <w:r>
+              <w:rPr>
+                <w:rFonts w:ascii="Calibri" w:hAnsi="Calibri"/>
+                <w:sz w:val="20"/>
+              </w:rPr>
+              <w:t>request_id</w:t>
+            </w:r>
+          </w:p>
+        </w:tc>
+        <w:tc>
+          <w:tcPr>
+            <w:tcW w:type="dxa" w:w="3402"/>
+          </w:tcPr>
+          <w:p>
+            <w:r/>
+            <w:r>
+              <w:rPr>
+                <w:rFonts w:ascii="Calibri" w:hAnsi="Calibri"/>
+                <w:sz w:val="20"/>
+              </w:rPr>
+              <w:t>state, N/P/K, rainfall, predicted_yield_kg_ha, t_ha</w:t>
+            </w:r>
+          </w:p>
+        </w:tc>
+      </w:tr>
+      <w:tr>
+        <w:tc>
+          <w:tcPr>
+            <w:tcW w:type="dxa" w:w="2268"/>
+            <w:shd w:fill="DCE6F1" w:color="auto" w:val="clear"/>
+          </w:tcPr>
+          <w:p>
+            <w:r/>
+            <w:r>
+              <w:rPr>
+                <w:rFonts w:ascii="Calibri" w:hAnsi="Calibri"/>
+                <w:sz w:val="20"/>
+              </w:rPr>
+              <w:t>uploaded_images</w:t>
+            </w:r>
+          </w:p>
+        </w:tc>
+        <w:tc>
+          <w:tcPr>
+            <w:tcW w:type="dxa" w:w="1701"/>
+            <w:shd w:fill="DCE6F1" w:color="auto" w:val="clear"/>
+          </w:tcPr>
+          <w:p>
+            <w:r/>
+            <w:r>
+              <w:rPr>
+                <w:rFonts w:ascii="Calibri" w:hAnsi="Calibri"/>
+                <w:sz w:val="20"/>
+              </w:rPr>
+              <w:t>image_id</w:t>
+            </w:r>
+          </w:p>
+        </w:tc>
+        <w:tc>
+          <w:tcPr>
+            <w:tcW w:type="dxa" w:w="1984"/>
+            <w:shd w:fill="DCE6F1" w:color="auto" w:val="clear"/>
+          </w:tcPr>
+          <w:p>
+            <w:r/>
+            <w:r>
+              <w:rPr>
+                <w:rFonts w:ascii="Calibri" w:hAnsi="Calibri"/>
+                <w:sz w:val="20"/>
+              </w:rPr>
+              <w:t>request_id</w:t>
+            </w:r>
+          </w:p>
+        </w:tc>
+        <w:tc>
+          <w:tcPr>
+            <w:tcW w:type="dxa" w:w="3402"/>
+            <w:shd w:fill="DCE6F1" w:color="auto" w:val="clear"/>
+          </w:tcPr>
+          <w:p>
+            <w:r/>
+            <w:r>
+              <w:rPr>
+                <w:rFonts w:ascii="Calibri" w:hAnsi="Calibri"/>
+                <w:sz w:val="20"/>
+              </w:rPr>
+              <w:t>original_filename, stored_filename, file_size_bytes</w:t>
             </w:r>
           </w:p>
         </w:tc>
       </w:tr>
     </w:tbl>
-    <w:p>
-      <w:r>
-        <w:rPr>
-          <w:rFonts w:ascii="Calibri" w:hAnsi="Calibri"/>
-          <w:i/>
-          <w:sz w:val="20"/>
-        </w:rPr>
-        <w:t>Entities: PredictionRequest, DiseasePrediction, YieldPrediction, UploadedImage.</w:t>
-      </w:r>
-    </w:p>
-    <w:p>
-      <w:pPr>
-        <w:ind w:left="340"/>
-        <w:shd w:fill="F0F4FF" w:val="clear"/>
-      </w:pPr>
-      <w:r>
-        <w:rPr>
-          <w:rFonts w:ascii="Courier New" w:hAnsi="Courier New"/>
-          <w:color w:val="1E1E1E"/>
-          <w:sz w:val="17"/>
-        </w:rPr>
-        <w:t>erDiagram</w:t>
-        <w:br/>
-        <w:t xml:space="preserve">    PredictionRequest {</w:t>
-        <w:br/>
-        <w:t xml:space="preserve">        int request_id PK</w:t>
-        <w:br/>
-        <w:t xml:space="preserve">        string session_id</w:t>
-        <w:br/>
-        <w:t xml:space="preserve">        string module_type</w:t>
-        <w:br/>
-        <w:t xml:space="preserve">        datetime timestamp</w:t>
-        <w:br/>
-        <w:t xml:space="preserve">        string ip_address</w:t>
-        <w:br/>
-        <w:t xml:space="preserve">    }</w:t>
-        <w:br/>
-        <w:t xml:space="preserve">    DiseasePrediction {</w:t>
-        <w:br/>
-        <w:t xml:space="preserve">        int disease_pred_id PK</w:t>
-        <w:br/>
-        <w:t xml:space="preserve">        int request_id FK</w:t>
-        <w:br/>
-        <w:t xml:space="preserve">        string image_filename</w:t>
-        <w:br/>
-        <w:t xml:space="preserve">        string predicted_class</w:t>
-        <w:br/>
-        <w:t xml:space="preserve">        float confidence_score</w:t>
-        <w:br/>
-        <w:t xml:space="preserve">    }</w:t>
-        <w:br/>
-        <w:t xml:space="preserve">    YieldPrediction {</w:t>
-        <w:br/>
-        <w:t xml:space="preserve">        int yield_pred_id PK</w:t>
-        <w:br/>
-        <w:t xml:space="preserve">        int request_id FK</w:t>
-        <w:br/>
-        <w:t xml:space="preserve">        string state</w:t>
-        <w:br/>
-        <w:t xml:space="preserve">        float N_req</w:t>
-        <w:br/>
-        <w:t xml:space="preserve">        float P_req</w:t>
-        <w:br/>
-        <w:t xml:space="preserve">        float K_req</w:t>
-        <w:br/>
-        <w:t xml:space="preserve">        float temperature_c</w:t>
-        <w:br/>
-        <w:t xml:space="preserve">        float humidity_pct</w:t>
-        <w:br/>
-        <w:t xml:space="preserve">        float rainfall_mm</w:t>
-        <w:br/>
-        <w:t xml:space="preserve">        float pH</w:t>
-        <w:br/>
-        <w:t xml:space="preserve">        float predicted_yield_kg_ha</w:t>
-        <w:br/>
-        <w:t xml:space="preserve">        float predicted_yield_t_ha</w:t>
-        <w:br/>
-        <w:t xml:space="preserve">    }</w:t>
-        <w:br/>
-        <w:t xml:space="preserve">    UploadedImage {</w:t>
-        <w:br/>
-        <w:t xml:space="preserve">        int image_id PK</w:t>
-        <w:br/>
-        <w:t xml:space="preserve">        int request_id FK</w:t>
-        <w:br/>
-        <w:t xml:space="preserve">        string original_filename</w:t>
-        <w:br/>
-        <w:t xml:space="preserve">        string stored_filename</w:t>
-        <w:br/>
-        <w:t xml:space="preserve">        int file_size_bytes</w:t>
-        <w:br/>
-        <w:t xml:space="preserve">        datetime uploaded_at</w:t>
-        <w:br/>
-        <w:t xml:space="preserve">    }</w:t>
-        <w:br/>
-        <w:t xml:space="preserve">    PredictionRequest ||--o| DiseasePrediction : "produces"</w:t>
-        <w:br/>
-        <w:t xml:space="preserve">    PredictionRequest ||--o| YieldPrediction : "produces"</w:t>
-        <w:br/>
-        <w:t xml:space="preserve">    PredictionRequest ||--|| UploadedImage : "attaches"</w:t>
-      </w:r>
-    </w:p>
     <w:p/>
     <w:p>
       <w:pPr>
@@ -4970,79 +5012,71 @@
         <w:t>10. API Design</w:t>
       </w:r>
     </w:p>
-    <w:tbl>
-      <w:tblPr>
-        <w:tblStyle w:val="TableGrid"/>
-        <w:tblW w:type="auto" w:w="0"/>
-        <w:tblLook w:firstColumn="1" w:firstRow="1" w:lastColumn="0" w:lastRow="0" w:noHBand="0" w:noVBand="1" w:val="04A0"/>
-      </w:tblPr>
-      <w:tblGrid>
-        <w:gridCol w:w="9066"/>
-      </w:tblGrid>
-      <w:tr>
-        <w:tc>
-          <w:tcPr>
-            <w:tcW w:type="dxa" w:w="9066"/>
-            <w:shd w:fill="1F497D" w:color="auto" w:val="clear"/>
-          </w:tcPr>
-          <w:p>
-            <w:r/>
-            <w:r>
-              <w:rPr>
-                <w:rFonts w:ascii="Calibri" w:hAnsi="Calibri"/>
-                <w:b/>
-                <w:color w:val="FFFFFF"/>
-                <w:sz w:val="20"/>
-              </w:rPr>
-              <w:t>📊  Diagram 10 — API Interaction Diagram  (Mermaid Diagram — renders in VS Code/GitHub/Notion)</w:t>
-            </w:r>
-          </w:p>
-        </w:tc>
-      </w:tr>
-    </w:tbl>
     <w:p>
+      <w:pPr>
+        <w:jc w:val="center"/>
+      </w:pPr>
+      <w:r>
+        <w:drawing>
+          <wp:inline xmlns:a="http://schemas.openxmlformats.org/drawingml/2006/main" xmlns:pic="http://schemas.openxmlformats.org/drawingml/2006/picture">
+            <wp:extent cx="5303520" cy="2986231"/>
+            <wp:docPr id="11" name="Picture 11"/>
+            <wp:cNvGraphicFramePr>
+              <a:graphicFrameLocks noChangeAspect="1"/>
+            </wp:cNvGraphicFramePr>
+            <a:graphic>
+              <a:graphicData uri="http://schemas.openxmlformats.org/drawingml/2006/picture">
+                <pic:pic>
+                  <pic:nvPicPr>
+                    <pic:cNvPr id="0" name="10_api_interaction.png"/>
+                    <pic:cNvPicPr/>
+                  </pic:nvPicPr>
+                  <pic:blipFill>
+                    <a:blip r:embed="rId19"/>
+                    <a:stretch>
+                      <a:fillRect/>
+                    </a:stretch>
+                  </pic:blipFill>
+                  <pic:spPr>
+                    <a:xfrm>
+                      <a:off x="0" y="0"/>
+                      <a:ext cx="5303520" cy="2986231"/>
+                    </a:xfrm>
+                    <a:prstGeom prst="rect"/>
+                  </pic:spPr>
+                </pic:pic>
+              </a:graphicData>
+            </a:graphic>
+          </wp:inline>
+        </w:drawing>
+      </w:r>
+    </w:p>
+    <w:p>
+      <w:pPr>
+        <w:jc w:val="center"/>
+      </w:pPr>
       <w:r>
         <w:rPr>
           <w:rFonts w:ascii="Calibri" w:hAnsi="Calibri"/>
           <w:i/>
-          <w:sz w:val="20"/>
+          <w:color w:val="505050"/>
+          <w:sz w:val="18"/>
         </w:rPr>
-        <w:t>Shows all HTTP endpoints, request formats and response formats.</w:t>
+        <w:t>Figure 10 — API Interaction Diagram</w:t>
       </w:r>
     </w:p>
     <w:p>
       <w:pPr>
-        <w:ind w:left="340"/>
-        <w:shd w:fill="F0F4FF" w:val="clear"/>
+        <w:ind w:left="170"/>
       </w:pPr>
       <w:r>
         <w:rPr>
-          <w:rFonts w:ascii="Courier New" w:hAnsi="Courier New"/>
-          <w:color w:val="1E1E1E"/>
-          <w:sz w:val="17"/>
+          <w:rFonts w:ascii="Calibri" w:hAnsi="Calibri"/>
+          <w:i/>
+          <w:color w:val="3C3C3C"/>
+          <w:sz w:val="20"/>
         </w:rPr>
-        <w:t>sequenceDiagram</w:t>
-        <w:br/>
-        <w:t xml:space="preserve">    participant Browser</w:t>
-        <w:br/>
-        <w:t xml:space="preserve">    participant FlaskRouter</w:t>
-        <w:br/>
-        <w:t xml:space="preserve">    participant DiseaseAPI as "POST /predict-disease"</w:t>
-        <w:br/>
-        <w:t xml:space="preserve">    participant YieldAPI as "POST /predict-yield"</w:t>
-        <w:br/>
-        <w:br/>
-        <w:t xml:space="preserve">    Browser-&gt;&gt;FlaskRouter: GET /</w:t>
-        <w:br/>
-        <w:t xml:space="preserve">    FlaskRouter--&gt;&gt;Browser: 200 index.html</w:t>
-        <w:br/>
-        <w:t xml:space="preserve">    Browser-&gt;&gt;DiseaseAPI: POST multipart image</w:t>
-        <w:br/>
-        <w:t xml:space="preserve">    DiseaseAPI--&gt;&gt;Browser: 200 {disease, confidence}</w:t>
-        <w:br/>
-        <w:t xml:space="preserve">    Browser-&gt;&gt;YieldAPI: POST form {state,N,P,K,temp,humidity,rainfall,pH}</w:t>
-        <w:br/>
-        <w:t xml:space="preserve">    YieldAPI--&gt;&gt;Browser: 200 {yield_kg_ha, yield_t_ha}</w:t>
+        <w:t>All HTTP endpoints with request formats and response formats.</w:t>
       </w:r>
     </w:p>
     <w:p/>
@@ -5055,7 +5089,7 @@
           <w:rFonts w:ascii="Calibri" w:hAnsi="Calibri"/>
           <w:color w:val="4472C4"/>
         </w:rPr>
-        <w:t>Endpoint: POST /predict-disease</w:t>
+        <w:t>POST /predict-disease</w:t>
       </w:r>
     </w:p>
     <w:tbl>
@@ -5133,7 +5167,7 @@
                 <w:rFonts w:ascii="Calibri" w:hAnsi="Calibri"/>
                 <w:sz w:val="20"/>
               </w:rPr>
-              <w:t>POST</w:t>
+              <w:t>POST | Content-Type: multipart/form-data</w:t>
             </w:r>
           </w:p>
         </w:tc>
@@ -5151,7 +5185,7 @@
                 <w:rFonts w:ascii="Calibri" w:hAnsi="Calibri"/>
                 <w:sz w:val="20"/>
               </w:rPr>
-              <w:t>Content-Type</w:t>
+              <w:t>Body</w:t>
             </w:r>
           </w:p>
         </w:tc>
@@ -5159,38 +5193,6 @@
           <w:tcPr>
             <w:tcW w:type="dxa" w:w="6520"/>
             <w:shd w:fill="DCE6F1" w:color="auto" w:val="clear"/>
-          </w:tcPr>
-          <w:p>
-            <w:r/>
-            <w:r>
-              <w:rPr>
-                <w:rFonts w:ascii="Calibri" w:hAnsi="Calibri"/>
-                <w:sz w:val="20"/>
-              </w:rPr>
-              <w:t>multipart/form-data</w:t>
-            </w:r>
-          </w:p>
-        </w:tc>
-      </w:tr>
-      <w:tr>
-        <w:tc>
-          <w:tcPr>
-            <w:tcW w:type="dxa" w:w="2835"/>
-          </w:tcPr>
-          <w:p>
-            <w:r/>
-            <w:r>
-              <w:rPr>
-                <w:rFonts w:ascii="Calibri" w:hAnsi="Calibri"/>
-                <w:sz w:val="20"/>
-              </w:rPr>
-              <w:t>Body field</w:t>
-            </w:r>
-          </w:p>
-        </w:tc>
-        <w:tc>
-          <w:tcPr>
-            <w:tcW w:type="dxa" w:w="6520"/>
           </w:tcPr>
           <w:p>
             <w:r/>
@@ -5208,6 +5210,38 @@
         <w:tc>
           <w:tcPr>
             <w:tcW w:type="dxa" w:w="2835"/>
+          </w:tcPr>
+          <w:p>
+            <w:r/>
+            <w:r>
+              <w:rPr>
+                <w:rFonts w:ascii="Calibri" w:hAnsi="Calibri"/>
+                <w:sz w:val="20"/>
+              </w:rPr>
+              <w:t>Success</w:t>
+            </w:r>
+          </w:p>
+        </w:tc>
+        <w:tc>
+          <w:tcPr>
+            <w:tcW w:type="dxa" w:w="6520"/>
+          </w:tcPr>
+          <w:p>
+            <w:r/>
+            <w:r>
+              <w:rPr>
+                <w:rFonts w:ascii="Calibri" w:hAnsi="Calibri"/>
+                <w:sz w:val="20"/>
+              </w:rPr>
+              <w:t>HTTP 200 — rendered HTML with disease label + confidence</w:t>
+            </w:r>
+          </w:p>
+        </w:tc>
+      </w:tr>
+      <w:tr>
+        <w:tc>
+          <w:tcPr>
+            <w:tcW w:type="dxa" w:w="2835"/>
             <w:shd w:fill="DCE6F1" w:color="auto" w:val="clear"/>
           </w:tcPr>
           <w:p>
@@ -5217,7 +5251,7 @@
                 <w:rFonts w:ascii="Calibri" w:hAnsi="Calibri"/>
                 <w:sz w:val="20"/>
               </w:rPr>
-              <w:t>Success Response</w:t>
+              <w:t>Error</w:t>
             </w:r>
           </w:p>
         </w:tc>
@@ -5225,38 +5259,6 @@
           <w:tcPr>
             <w:tcW w:type="dxa" w:w="6520"/>
             <w:shd w:fill="DCE6F1" w:color="auto" w:val="clear"/>
-          </w:tcPr>
-          <w:p>
-            <w:r/>
-            <w:r>
-              <w:rPr>
-                <w:rFonts w:ascii="Calibri" w:hAnsi="Calibri"/>
-                <w:sz w:val="20"/>
-              </w:rPr>
-              <w:t>HTTP 200 — rendered HTML with disease label and confidence</w:t>
-            </w:r>
-          </w:p>
-        </w:tc>
-      </w:tr>
-      <w:tr>
-        <w:tc>
-          <w:tcPr>
-            <w:tcW w:type="dxa" w:w="2835"/>
-          </w:tcPr>
-          <w:p>
-            <w:r/>
-            <w:r>
-              <w:rPr>
-                <w:rFonts w:ascii="Calibri" w:hAnsi="Calibri"/>
-                <w:sz w:val="20"/>
-              </w:rPr>
-              <w:t>Error Response</w:t>
-            </w:r>
-          </w:p>
-        </w:tc>
-        <w:tc>
-          <w:tcPr>
-            <w:tcW w:type="dxa" w:w="6520"/>
           </w:tcPr>
           <w:p>
             <w:r/>
@@ -5281,7 +5283,7 @@
           <w:rFonts w:ascii="Calibri" w:hAnsi="Calibri"/>
           <w:color w:val="1F497D"/>
         </w:rPr>
-        <w:t>Example Response JSON</w:t>
+        <w:t>Example Response</w:t>
       </w:r>
     </w:p>
     <w:p>
@@ -5292,7 +5294,6 @@
       <w:r>
         <w:rPr>
           <w:rFonts w:ascii="Courier New" w:hAnsi="Courier New"/>
-          <w:color w:val="1E1E1E"/>
           <w:sz w:val="17"/>
         </w:rPr>
         <w:t>{</w:t>
@@ -5301,17 +5302,9 @@
         <w:br/>
         <w:t xml:space="preserve">  "confidence": 0.9412,</w:t>
         <w:br/>
-        <w:t xml:space="preserve">  "all_probabilities": {</w:t>
+        <w:t xml:space="preserve">  "all_probabilities": {"Healthy": 0.0231, "Brown Spot": 0.9412,</w:t>
         <w:br/>
-        <w:t xml:space="preserve">    "Healthy": 0.0231,</w:t>
-        <w:br/>
-        <w:t xml:space="preserve">    "Brown Spot": 0.9412,</w:t>
-        <w:br/>
-        <w:t xml:space="preserve">    "Leaf Blast": 0.0247,</w:t>
-        <w:br/>
-        <w:t xml:space="preserve">    "Hispa": 0.0110</w:t>
-        <w:br/>
-        <w:t xml:space="preserve">  }</w:t>
+        <w:t xml:space="preserve">                        "Leaf Blast": 0.0247, "Hispa": 0.0110}</w:t>
         <w:br/>
         <w:t>}</w:t>
       </w:r>
@@ -5326,7 +5319,7 @@
           <w:rFonts w:ascii="Calibri" w:hAnsi="Calibri"/>
           <w:color w:val="4472C4"/>
         </w:rPr>
-        <w:t>Endpoint: POST /predict-yield</w:t>
+        <w:t>POST /predict-yield</w:t>
       </w:r>
     </w:p>
     <w:tbl>
@@ -5404,7 +5397,7 @@
                 <w:rFonts w:ascii="Calibri" w:hAnsi="Calibri"/>
                 <w:sz w:val="20"/>
               </w:rPr>
-              <w:t>POST</w:t>
+              <w:t>POST | Content-Type: application/x-www-form-urlencoded</w:t>
             </w:r>
           </w:p>
         </w:tc>
@@ -5422,7 +5415,7 @@
                 <w:rFonts w:ascii="Calibri" w:hAnsi="Calibri"/>
                 <w:sz w:val="20"/>
               </w:rPr>
-              <w:t>Content-Type</w:t>
+              <w:t>Body fields</w:t>
             </w:r>
           </w:p>
         </w:tc>
@@ -5430,38 +5423,6 @@
           <w:tcPr>
             <w:tcW w:type="dxa" w:w="6520"/>
             <w:shd w:fill="DCE6F1" w:color="auto" w:val="clear"/>
-          </w:tcPr>
-          <w:p>
-            <w:r/>
-            <w:r>
-              <w:rPr>
-                <w:rFonts w:ascii="Calibri" w:hAnsi="Calibri"/>
-                <w:sz w:val="20"/>
-              </w:rPr>
-              <w:t>application/x-www-form-urlencoded</w:t>
-            </w:r>
-          </w:p>
-        </w:tc>
-      </w:tr>
-      <w:tr>
-        <w:tc>
-          <w:tcPr>
-            <w:tcW w:type="dxa" w:w="2835"/>
-          </w:tcPr>
-          <w:p>
-            <w:r/>
-            <w:r>
-              <w:rPr>
-                <w:rFonts w:ascii="Calibri" w:hAnsi="Calibri"/>
-                <w:sz w:val="20"/>
-              </w:rPr>
-              <w:t>Body fields</w:t>
-            </w:r>
-          </w:p>
-        </w:tc>
-        <w:tc>
-          <w:tcPr>
-            <w:tcW w:type="dxa" w:w="6520"/>
           </w:tcPr>
           <w:p>
             <w:r/>
@@ -5479,6 +5440,38 @@
         <w:tc>
           <w:tcPr>
             <w:tcW w:type="dxa" w:w="2835"/>
+          </w:tcPr>
+          <w:p>
+            <w:r/>
+            <w:r>
+              <w:rPr>
+                <w:rFonts w:ascii="Calibri" w:hAnsi="Calibri"/>
+                <w:sz w:val="20"/>
+              </w:rPr>
+              <w:t>Success</w:t>
+            </w:r>
+          </w:p>
+        </w:tc>
+        <w:tc>
+          <w:tcPr>
+            <w:tcW w:type="dxa" w:w="6520"/>
+          </w:tcPr>
+          <w:p>
+            <w:r/>
+            <w:r>
+              <w:rPr>
+                <w:rFonts w:ascii="Calibri" w:hAnsi="Calibri"/>
+                <w:sz w:val="20"/>
+              </w:rPr>
+              <w:t>HTTP 200 — rendered HTML with predicted yield kg/ha and t/ha</w:t>
+            </w:r>
+          </w:p>
+        </w:tc>
+      </w:tr>
+      <w:tr>
+        <w:tc>
+          <w:tcPr>
+            <w:tcW w:type="dxa" w:w="2835"/>
             <w:shd w:fill="DCE6F1" w:color="auto" w:val="clear"/>
           </w:tcPr>
           <w:p>
@@ -5488,7 +5481,7 @@
                 <w:rFonts w:ascii="Calibri" w:hAnsi="Calibri"/>
                 <w:sz w:val="20"/>
               </w:rPr>
-              <w:t>Success Response</w:t>
+              <w:t>Error</w:t>
             </w:r>
           </w:p>
         </w:tc>
@@ -5496,38 +5489,6 @@
           <w:tcPr>
             <w:tcW w:type="dxa" w:w="6520"/>
             <w:shd w:fill="DCE6F1" w:color="auto" w:val="clear"/>
-          </w:tcPr>
-          <w:p>
-            <w:r/>
-            <w:r>
-              <w:rPr>
-                <w:rFonts w:ascii="Calibri" w:hAnsi="Calibri"/>
-                <w:sz w:val="20"/>
-              </w:rPr>
-              <w:t>HTTP 200 — rendered HTML with predicted yield</w:t>
-            </w:r>
-          </w:p>
-        </w:tc>
-      </w:tr>
-      <w:tr>
-        <w:tc>
-          <w:tcPr>
-            <w:tcW w:type="dxa" w:w="2835"/>
-          </w:tcPr>
-          <w:p>
-            <w:r/>
-            <w:r>
-              <w:rPr>
-                <w:rFonts w:ascii="Calibri" w:hAnsi="Calibri"/>
-                <w:sz w:val="20"/>
-              </w:rPr>
-              <w:t>Error Response</w:t>
-            </w:r>
-          </w:p>
-        </w:tc>
-        <w:tc>
-          <w:tcPr>
-            <w:tcW w:type="dxa" w:w="6520"/>
           </w:tcPr>
           <w:p>
             <w:r/>
@@ -5552,7 +5513,7 @@
           <w:rFonts w:ascii="Calibri" w:hAnsi="Calibri"/>
           <w:color w:val="1F497D"/>
         </w:rPr>
-        <w:t>Example Request Body</w:t>
+        <w:t>Example Request</w:t>
       </w:r>
     </w:p>
     <w:p>
@@ -5563,7 +5524,6 @@
       <w:r>
         <w:rPr>
           <w:rFonts w:ascii="Courier New" w:hAnsi="Courier New"/>
-          <w:color w:val="1E1E1E"/>
           <w:sz w:val="17"/>
         </w:rPr>
         <w:t>state=Punjab&amp;N=90&amp;P=42&amp;K=43&amp;temperature=25&amp;humidity=80&amp;rainfall=200&amp;pH=6.5</w:t>
@@ -5578,7 +5538,7 @@
           <w:rFonts w:ascii="Calibri" w:hAnsi="Calibri"/>
           <w:color w:val="1F497D"/>
         </w:rPr>
-        <w:t>Example Response JSON</w:t>
+        <w:t>Example Response</w:t>
       </w:r>
     </w:p>
     <w:p>
@@ -5589,7 +5549,6 @@
       <w:r>
         <w:rPr>
           <w:rFonts w:ascii="Courier New" w:hAnsi="Courier New"/>
-          <w:color w:val="1E1E1E"/>
           <w:sz w:val="17"/>
         </w:rPr>
         <w:t>{</w:t>
@@ -5599,10 +5558,6 @@
         <w:t xml:space="preserve">  "predicted_yield_kg_ha": 3987.43,</w:t>
         <w:br/>
         <w:t xml:space="preserve">  "predicted_yield_t_ha": 3.99,</w:t>
-        <w:br/>
-        <w:t xml:space="preserve">  "inputs_received": {"N": 90, "P": 42, "K": 43, "temperature": 25,</w:t>
-        <w:br/>
-        <w:t xml:space="preserve">                       "humidity": 80, "rainfall": 200, "pH": 6.5},</w:t>
         <w:br/>
         <w:t xml:space="preserve">  "auto_filled": {"year": 2017, "wind_speed": 3.5, "solar_radiation": 18.0}</w:t>
         <w:br/>
@@ -5682,7 +5637,7 @@
                 <w:rFonts w:ascii="Calibri" w:hAnsi="Calibri"/>
                 <w:sz w:val="20"/>
               </w:rPr>
-              <w:t>Malicious file upload</w:t>
+              <w:t>Malicious file uploads</w:t>
             </w:r>
           </w:p>
         </w:tc>
@@ -5697,7 +5652,7 @@
                 <w:rFonts w:ascii="Calibri" w:hAnsi="Calibri"/>
                 <w:sz w:val="20"/>
               </w:rPr>
-              <w:t>Validate MIME type via Pillow; restrict to .jpg/.jpeg/.png; use secure_filename()</w:t>
+              <w:t>Validate MIME type with Pillow; restrict to .jpg/.jpeg/.png; use secure_filename()</w:t>
             </w:r>
           </w:p>
         </w:tc>
@@ -5715,7 +5670,7 @@
                 <w:rFonts w:ascii="Calibri" w:hAnsi="Calibri"/>
                 <w:sz w:val="20"/>
               </w:rPr>
-              <w:t>Oversized upload DoS</w:t>
+              <w:t>Upload DoS</w:t>
             </w:r>
           </w:p>
         </w:tc>
@@ -5763,7 +5718,7 @@
                 <w:rFonts w:ascii="Calibri" w:hAnsi="Calibri"/>
                 <w:sz w:val="20"/>
               </w:rPr>
-              <w:t>Use uuid4() for stored filenames; never use raw user-supplied filenames</w:t>
+              <w:t>Use uuid4() for stored filenames — never use raw user-supplied names</w:t>
             </w:r>
           </w:p>
         </w:tc>
@@ -5781,7 +5736,7 @@
                 <w:rFonts w:ascii="Calibri" w:hAnsi="Calibri"/>
                 <w:sz w:val="20"/>
               </w:rPr>
-              <w:t>Invalid numeric inputs</w:t>
+              <w:t>Invalid inputs</w:t>
             </w:r>
           </w:p>
         </w:tc>
@@ -5797,7 +5752,7 @@
                 <w:rFonts w:ascii="Calibri" w:hAnsi="Calibri"/>
                 <w:sz w:val="20"/>
               </w:rPr>
-              <w:t>Validate all form fields for type and range; return HTTP 400 on failure</w:t>
+              <w:t>Validate all form fields for type and range; HTTP 400 on failure</w:t>
             </w:r>
           </w:p>
         </w:tc>
@@ -5814,7 +5769,7 @@
                 <w:rFonts w:ascii="Calibri" w:hAnsi="Calibri"/>
                 <w:sz w:val="20"/>
               </w:rPr>
-              <w:t>Model file tampering</w:t>
+              <w:t>Model tampering</w:t>
             </w:r>
           </w:p>
         </w:tc>
@@ -5829,7 +5784,7 @@
                 <w:rFonts w:ascii="Calibri" w:hAnsi="Calibri"/>
                 <w:sz w:val="20"/>
               </w:rPr>
-              <w:t>Version-control model files; SHA-256 checksum verification at startup</w:t>
+              <w:t>Version-control model files; SHA-256 checksum at startup</w:t>
             </w:r>
           </w:p>
         </w:tc>
@@ -5847,7 +5802,7 @@
                 <w:rFonts w:ascii="Calibri" w:hAnsi="Calibri"/>
                 <w:sz w:val="20"/>
               </w:rPr>
-              <w:t>Flask debug mode exposure</w:t>
+              <w:t>Debug mode exposure</w:t>
             </w:r>
           </w:p>
         </w:tc>
@@ -5880,7 +5835,7 @@
                 <w:rFonts w:ascii="Calibri" w:hAnsi="Calibri"/>
                 <w:sz w:val="20"/>
               </w:rPr>
-              <w:t>CSRF attacks</w:t>
+              <w:t>CSRF</w:t>
             </w:r>
           </w:p>
         </w:tc>
@@ -5958,7 +5913,7 @@
                 <w:color w:val="FFFFFF"/>
                 <w:sz w:val="20"/>
               </w:rPr>
-              <w:t>Current State</w:t>
+              <w:t>Current</w:t>
             </w:r>
           </w:p>
         </w:tc>
@@ -6008,7 +5963,7 @@
                 <w:rFonts w:ascii="Calibri" w:hAnsi="Calibri"/>
                 <w:sz w:val="20"/>
               </w:rPr>
-              <w:t>Single-threaded Flask dev server</w:t>
+              <w:t>Single-threaded dev server</w:t>
             </w:r>
           </w:p>
         </w:tc>
@@ -6023,7 +5978,7 @@
                 <w:rFonts w:ascii="Calibri" w:hAnsi="Calibri"/>
                 <w:sz w:val="20"/>
               </w:rPr>
-              <w:t>Gunicorn (multi-worker) + Nginx</w:t>
+              <w:t>Gunicorn (multi-worker) + Nginx reverse proxy</w:t>
             </w:r>
           </w:p>
         </w:tc>
@@ -6057,7 +6012,7 @@
                 <w:rFonts w:ascii="Calibri" w:hAnsi="Calibri"/>
                 <w:sz w:val="20"/>
               </w:rPr>
-              <w:t>Loaded once per process</w:t>
+              <w:t>Once per process</w:t>
             </w:r>
           </w:p>
         </w:tc>
@@ -6073,7 +6028,7 @@
                 <w:rFonts w:ascii="Calibri" w:hAnsi="Calibri"/>
                 <w:sz w:val="20"/>
               </w:rPr>
-              <w:t>TF Serving or Triton inference server</w:t>
+              <w:t>TF Serving / Triton for shared model server</w:t>
             </w:r>
           </w:p>
         </w:tc>
@@ -6105,7 +6060,7 @@
                 <w:rFonts w:ascii="Calibri" w:hAnsi="Calibri"/>
                 <w:sz w:val="20"/>
               </w:rPr>
-              <w:t>Local uploads/ directory</w:t>
+              <w:t>Local uploads/</w:t>
             </w:r>
           </w:p>
         </w:tc>
@@ -6120,7 +6075,7 @@
                 <w:rFonts w:ascii="Calibri" w:hAnsi="Calibri"/>
                 <w:sz w:val="20"/>
               </w:rPr>
-              <w:t>AWS S3 / Google Cloud Storage</w:t>
+              <w:t>AWS S3 or Google Cloud Storage</w:t>
             </w:r>
           </w:p>
         </w:tc>
@@ -6170,7 +6125,7 @@
                 <w:rFonts w:ascii="Calibri" w:hAnsi="Calibri"/>
                 <w:sz w:val="20"/>
               </w:rPr>
-              <w:t>PostgreSQL + SQLAlchemy</w:t>
+              <w:t>PostgreSQL + SQLAlchemy ORM</w:t>
             </w:r>
           </w:p>
         </w:tc>
@@ -6217,7 +6172,7 @@
                 <w:rFonts w:ascii="Calibri" w:hAnsi="Calibri"/>
                 <w:sz w:val="20"/>
               </w:rPr>
-              <w:t>Docker + docker-compose for reproducible deployment</w:t>
+              <w:t>Docker + docker-compose</w:t>
             </w:r>
           </w:p>
         </w:tc>
@@ -6267,7 +6222,7 @@
                 <w:rFonts w:ascii="Calibri" w:hAnsi="Calibri"/>
                 <w:sz w:val="20"/>
               </w:rPr>
-              <w:t>GitHub Actions for automated testing and deployment</w:t>
+              <w:t>GitHub Actions automated pipeline</w:t>
             </w:r>
           </w:p>
         </w:tc>
@@ -6295,7 +6250,7 @@
           <w:rFonts w:ascii="Calibri" w:hAnsi="Calibri"/>
           <w:color w:val="4472C4"/>
         </w:rPr>
-        <w:t>13.1 Short-Term</w:t>
+        <w:t>Short-Term</w:t>
       </w:r>
     </w:p>
     <w:p>
@@ -6307,31 +6262,7 @@
           <w:rFonts w:ascii="Calibri" w:hAnsi="Calibri"/>
           <w:sz w:val="22"/>
         </w:rPr>
-        <w:t>Add SQLite/PostgreSQL database to persist prediction history.</w:t>
-      </w:r>
-    </w:p>
-    <w:p>
-      <w:pPr>
-        <w:pStyle w:val="ListBullet"/>
-      </w:pPr>
-      <w:r>
-        <w:rPr>
-          <w:rFonts w:ascii="Calibri" w:hAnsi="Calibri"/>
-          <w:sz w:val="22"/>
-        </w:rPr>
-        <w:t>Implement user session tracking for anonymous prediction association.</w:t>
-      </w:r>
-    </w:p>
-    <w:p>
-      <w:pPr>
-        <w:pStyle w:val="ListBullet"/>
-      </w:pPr>
-      <w:r>
-        <w:rPr>
-          <w:rFonts w:ascii="Calibri" w:hAnsi="Calibri"/>
-          <w:sz w:val="22"/>
-        </w:rPr>
-        <w:t>Add confidence threshold warnings (&lt;50% confidence flagged to user).</w:t>
+        <w:t>SQLite/PostgreSQL database for prediction history and analytics dashboard.</w:t>
       </w:r>
     </w:p>
     <w:p>
@@ -6348,14 +6279,14 @@
     </w:p>
     <w:p>
       <w:pPr>
-        <w:pStyle w:val="Heading2"/>
+        <w:pStyle w:val="ListBullet"/>
       </w:pPr>
       <w:r>
         <w:rPr>
           <w:rFonts w:ascii="Calibri" w:hAnsi="Calibri"/>
-          <w:color w:val="4472C4"/>
+          <w:sz w:val="22"/>
         </w:rPr>
-        <w:t>13.2 Medium-Term</w:t>
+        <w:t>Confidence threshold warnings (&lt;50% flagged with a caution banner).</w:t>
       </w:r>
     </w:p>
     <w:p>
@@ -6367,7 +6298,19 @@
           <w:rFonts w:ascii="Calibri" w:hAnsi="Calibri"/>
           <w:sz w:val="22"/>
         </w:rPr>
-        <w:t>Decouple APIs to return JSON — enabling mobile app integration.</w:t>
+        <w:t>User session tracking for anonymous prediction association.</w:t>
+      </w:r>
+    </w:p>
+    <w:p>
+      <w:pPr>
+        <w:pStyle w:val="Heading2"/>
+      </w:pPr>
+      <w:r>
+        <w:rPr>
+          <w:rFonts w:ascii="Calibri" w:hAnsi="Calibri"/>
+          <w:color w:val="4472C4"/>
+        </w:rPr>
+        <w:t>Medium-Term</w:t>
       </w:r>
     </w:p>
     <w:p>
@@ -6379,7 +6322,7 @@
           <w:rFonts w:ascii="Calibri" w:hAnsi="Calibri"/>
           <w:sz w:val="22"/>
         </w:rPr>
-        <w:t>MLflow tracking server for model versioning and retraining pipelines.</w:t>
+        <w:t>REST JSON API endpoints enabling mobile app integration.</w:t>
       </w:r>
     </w:p>
     <w:p>
@@ -6391,7 +6334,7 @@
           <w:rFonts w:ascii="Calibri" w:hAnsi="Calibri"/>
           <w:sz w:val="22"/>
         </w:rPr>
-        <w:t>Expand CNN to detect Sheath Blight and Bacterial Leaf Blight.</w:t>
+        <w:t>MLflow model versioning and automated retraining pipeline.</w:t>
       </w:r>
     </w:p>
     <w:p>
@@ -6403,7 +6346,19 @@
           <w:rFonts w:ascii="Calibri" w:hAnsi="Calibri"/>
           <w:sz w:val="22"/>
         </w:rPr>
-        <w:t>Extend yield model to wheat, maize, soybean with multi-crop datasets.</w:t>
+        <w:t>Extend CNN to detect Sheath Blight, Bacterial Leaf Blight.</w:t>
+      </w:r>
+    </w:p>
+    <w:p>
+      <w:pPr>
+        <w:pStyle w:val="ListBullet"/>
+      </w:pPr>
+      <w:r>
+        <w:rPr>
+          <w:rFonts w:ascii="Calibri" w:hAnsi="Calibri"/>
+          <w:sz w:val="22"/>
+        </w:rPr>
+        <w:t>Extend RF yield model to wheat, maize, soybean.</w:t>
       </w:r>
     </w:p>
     <w:p>
@@ -6415,7 +6370,7 @@
           <w:rFonts w:ascii="Calibri" w:hAnsi="Calibri"/>
           <w:color w:val="4472C4"/>
         </w:rPr>
-        <w:t>13.3 Long-Term</w:t>
+        <w:t>Long-Term</w:t>
       </w:r>
     </w:p>
     <w:p>
@@ -6427,7 +6382,7 @@
           <w:rFonts w:ascii="Calibri" w:hAnsi="Calibri"/>
           <w:sz w:val="22"/>
         </w:rPr>
-        <w:t>Microservices migration: extract Disease and Yield modules as independent services.</w:t>
+        <w:t>TensorFlow Lite quantisation for offline inference on Android smartphones.</w:t>
       </w:r>
     </w:p>
     <w:p>
@@ -6439,19 +6394,7 @@
           <w:rFonts w:ascii="Calibri" w:hAnsi="Calibri"/>
           <w:sz w:val="22"/>
         </w:rPr>
-        <w:t>TensorFlow Lite quantisation for offline inference on low-power Android devices.</w:t>
-      </w:r>
-    </w:p>
-    <w:p>
-      <w:pPr>
-        <w:pStyle w:val="ListBullet"/>
-      </w:pPr>
-      <w:r>
-        <w:rPr>
-          <w:rFonts w:ascii="Calibri" w:hAnsi="Calibri"/>
-          <w:sz w:val="22"/>
-        </w:rPr>
-        <w:t>NDVI satellite imagery integration as auto-populated yield prediction feature.</w:t>
+        <w:t>NDVI satellite imagery as an auto-populated yield prediction feature.</w:t>
       </w:r>
     </w:p>
     <w:p>
@@ -6464,6 +6407,18 @@
           <w:sz w:val="22"/>
         </w:rPr>
         <w:t>Federated learning for privacy-preserving training across farmer cooperatives.</w:t>
+      </w:r>
+    </w:p>
+    <w:p>
+      <w:pPr>
+        <w:pStyle w:val="ListBullet"/>
+      </w:pPr>
+      <w:r>
+        <w:rPr>
+          <w:rFonts w:ascii="Calibri" w:hAnsi="Calibri"/>
+          <w:sz w:val="22"/>
+        </w:rPr>
+        <w:t>Microservices extraction of Disease and Yield modules for independent scaling.</w:t>
       </w:r>
     </w:p>
     <w:p/>
@@ -6563,7 +6518,7 @@
           <w:rFonts w:ascii="Calibri" w:hAnsi="Calibri"/>
           <w:sz w:val="22"/>
         </w:rPr>
-        <w:t>TensorFlow Documentation (2024). https://www.tensorflow.org/api_docs/python/tf/keras</w:t>
+        <w:t>TensorFlow Documentation (2024). https://www.tensorflow.org/</w:t>
       </w:r>
     </w:p>
     <w:p>
@@ -6583,7 +6538,7 @@
           <w:rFonts w:ascii="Calibri" w:hAnsi="Calibri"/>
           <w:sz w:val="22"/>
         </w:rPr>
-        <w:t>Scikit-learn Documentation (2024). https://scikit-learn.org/stable/modules/ensemble.html</w:t>
+        <w:t>Scikit-learn Documentation (2024). https://scikit-learn.org/</w:t>
       </w:r>
     </w:p>
     <w:p>
@@ -6603,7 +6558,7 @@
           <w:rFonts w:ascii="Calibri" w:hAnsi="Calibri"/>
           <w:sz w:val="22"/>
         </w:rPr>
-        <w:t>IEEE Standard 1016-2009. IEEE Standard for Information Technology — Software Design Descriptions.</w:t>
+        <w:t>IEEE Standard 1016-2009. IEEE Standard for Software Design Descriptions.</w:t>
       </w:r>
     </w:p>
     <w:p/>

</xml_diff>